<commit_message>
New dendritic learn re-audit
</commit_message>
<xml_diff>
--- a/Docs/Audit/TimeLearner-2026-09-26-review/TIMELEARNER_AUDIT_AND_PLAN_2026-10-20.ru.docx
+++ b/Docs/Audit/TimeLearner-2026-09-26-review/TIMELEARNER_AUDIT_AND_PLAN_2026-10-20.ru.docx
@@ -6240,6 +6240,3567 @@
       </w:r>
       <w:r>
         <w:t xml:space="preserve">: reflog root и сабмодулей, сверка размеров файлов с origin.</w:t>
+      </w:r>
+    </w:p>
+    <w:p>
+      <w:pPr>
+        <w:pStyle w:val="Heading2"/>
+      </w:pPr>
+      <w:r>
+        <w:t xml:space="preserve">Аудит ветки timelearner_fix2 (23.10)</w:t>
+      </w:r>
+    </w:p>
+    <w:p>
+      <w:pPr/>
+      <w:r>
+        <w:t xml:space="preserve">Изучено: root </w:t>
+      </w:r>
+      <w:r>
+        <w:rPr>
+          <w:rStyle w:val="CodeChar"/>
+        </w:rPr>
+        <w:t xml:space="preserve">1925be8</w:t>
+      </w:r>
+      <w:r>
+        <w:t xml:space="preserve"> (129 коммитов после </w:t>
+      </w:r>
+      <w:r>
+        <w:rPr>
+          <w:rStyle w:val="CodeChar"/>
+        </w:rPr>
+        <w:t xml:space="preserve">timelearner_fix</w:t>
+      </w:r>
+      <w:r>
+        <w:t xml:space="preserve">), Bin </w:t>
+      </w:r>
+      <w:r>
+        <w:rPr>
+          <w:rStyle w:val="CodeChar"/>
+        </w:rPr>
+        <w:t xml:space="preserve">ab8c5bae</w:t>
+      </w:r>
+      <w:r>
+        <w:t xml:space="preserve"> (8), PulseLib </w:t>
+      </w:r>
+      <w:r>
+        <w:rPr>
+          <w:rStyle w:val="CodeChar"/>
+        </w:rPr>
+        <w:t xml:space="preserve">35cd074</w:t>
+      </w:r>
+      <w:r>
+        <w:t xml:space="preserve"> (9); сводки G1, E2, CL-N1, H0a/H0b, конфиги </w:t>
+      </w:r>
+      <w:r>
+        <w:rPr>
+          <w:rStyle w:val="CodeChar"/>
+        </w:rPr>
+        <w:t xml:space="preserve">SelectivityTauCm</w:t>
+      </w:r>
+      <w:r>
+        <w:t xml:space="preserve"> (44 ячейки). Сырые логи прогонов с серверов не смотрелись: их нет в git.</w:t>
+      </w:r>
+    </w:p>
+    <w:p>
+      <w:pPr/>
+      <w:r>
+        <w:rPr>
+          <w:b/>
+        </w:rPr>
+        <w:t xml:space="preserve">Главный вывод: последняя волна H0b не могла дать PASS по построению, а «хуже, чем раньше» — во многом артефакт отбора и учёта, а не новая поломка тренера.</w:t>
+      </w:r>
+    </w:p>
+    <w:p>
+      <w:pPr>
+        <w:pStyle w:val="Heading3"/>
+      </w:pPr>
+      <w:r>
+        <w:t xml:space="preserve">Ошибки, найденные в экспериментах</w:t>
+      </w:r>
+    </w:p>
+    <w:p>
+      <w:pPr>
+        <w:pStyle w:val="ListParagraph"/>
+        <w:numPr>
+          <w:ilvl w:val="0"/>
+          <w:numId w:val="21"/>
+        </w:numPr>
+      </w:pPr>
+      <w:r>
+        <w:rPr>
+          <w:b/>
+        </w:rPr>
+        <w:t xml:space="preserve">H0 (τ(Cm) per Span) не меняет задачу.</w:t>
+      </w:r>
+      <w:r>
+        <w:t xml:space="preserve"> Пассивный кабель линеен и инвариантен к масштабу времени. Если τ уменьшить пропорционально длине паттерна, отношение FWHM/span остаётся тем же (~0.34), и запас разделимости тоже не меняется. Таблица H0a сама показывает </w:t>
+      </w:r>
+      <w:r>
+        <w:rPr>
+          <w:rStyle w:val="CodeChar"/>
+        </w:rPr>
+        <w:t xml:space="preserve">m_oracle ≈ −0.02…−0.05</w:t>
+      </w:r>
+      <w:r>
+        <w:t xml:space="preserve"> для всех Span. Волна из 20 ячеек проверяла пересчитанную в другой масштаб старую задачу 480 мс, для которой отрицательный запас был предсказан заранее. Улучшение относительно legacy (τ = 10 мс) при этом могли дать только нелинейности nextseg/preinh, но в H0 τ подогнан так, что они срабатывают в том же относительном режиме.</w:t>
+      </w:r>
+    </w:p>
+    <w:p>
+      <w:pPr>
+        <w:pStyle w:val="ListParagraph"/>
+        <w:numPr>
+          <w:ilvl w:val="0"/>
+          <w:numId w:val="21"/>
+        </w:numPr>
+      </w:pPr>
+      <w:r>
+        <w:rPr>
+          <w:b/>
+        </w:rPr>
+        <w:t xml:space="preserve">Параметры тренера в H0 не масштабированы вместе с τ.</w:t>
+      </w:r>
+      <w:r>
+        <w:t xml:space="preserve"> </w:t>
+      </w:r>
+      <w:r>
+        <w:rPr>
+          <w:rStyle w:val="CodeChar"/>
+        </w:rPr>
+        <w:t xml:space="preserve">EstDelayPerSeg</w:t>
+      </w:r>
+      <w:r>
+        <w:t xml:space="preserve"> в Classic S25/S50 = 0.002 при физическом δ ≈ τ = 0.5/1 мс (в 4 и 2 раза больше). У Branch оценка задержки вообще не читается из XML, а константа 0.005 в 10, 5 и 2 раза больше нужной на S25, S50 и S100 и в 2 раза меньше на S480. Флаг </w:t>
+      </w:r>
+      <w:r>
+        <w:rPr>
+          <w:rStyle w:val="CodeChar"/>
+        </w:rPr>
+        <w:t xml:space="preserve">EstDelayPerSegInit</w:t>
+      </w:r>
+      <w:r>
+        <w:t xml:space="preserve"> из E1 в PulseLib fix2 не попал. Шаги по длине на старте поэтому промахиваются в разы, и это прямой кандидат на массовое </w:t>
+      </w:r>
+      <w:r>
+        <w:rPr>
+          <w:rStyle w:val="CodeChar"/>
+        </w:rPr>
+        <w:t xml:space="preserve">not_converged_at_stop</w:t>
+      </w:r>
+      <w:r>
+        <w:t xml:space="preserve">.</w:t>
+      </w:r>
+    </w:p>
+    <w:p>
+      <w:pPr>
+        <w:pStyle w:val="ListParagraph"/>
+        <w:numPr>
+          <w:ilvl w:val="0"/>
+          <w:numId w:val="21"/>
+        </w:numPr>
+      </w:pPr>
+      <w:r>
+        <w:rPr>
+          <w:b/>
+        </w:rPr>
+        <w:t xml:space="preserve">Шаг интегрирования.</w:t>
+      </w:r>
+      <w:r>
+        <w:t xml:space="preserve"> Branch S25 gen/nextseg: Train на 20 кГц, Test на 2 кГц при τ = 0.5 мс. На Test dt/τ = 1.0 — граница устойчивости явного Эйлера, и динамика Train ≠ Test. Унаследовано из legacy-шаблона, где при τ = 10 мс это было безвредно.</w:t>
+      </w:r>
+    </w:p>
+    <w:p>
+      <w:pPr>
+        <w:pStyle w:val="ListParagraph"/>
+        <w:numPr>
+          <w:ilvl w:val="0"/>
+          <w:numId w:val="21"/>
+        </w:numPr>
+      </w:pPr>
+      <w:r>
+        <w:rPr>
+          <w:b/>
+        </w:rPr>
+        <w:t xml:space="preserve">A15 в новых шаблонах.</w:t>
+      </w:r>
+      <w:r>
+        <w:t xml:space="preserve"> B1/B2 починили только </w:t>
+      </w:r>
+      <w:r>
+        <w:rPr>
+          <w:rStyle w:val="CodeChar"/>
+        </w:rPr>
+        <w:t xml:space="preserve">TimeLearnerMatrix/inputs</w:t>
+      </w:r>
+      <w:r>
+        <w:t xml:space="preserve">. Classic S25 (4 ячейки H0) унаследовал повреждённую Test-проводку из </w:t>
+      </w:r>
+      <w:r>
+        <w:rPr>
+          <w:rStyle w:val="CodeChar"/>
+        </w:rPr>
+        <w:t xml:space="preserve">SelectivityAsymRm/EXP_span25ms_packA_gen</w:t>
+      </w:r>
+      <w:r>
+        <w:t xml:space="preserve"> (</w:t>
+      </w:r>
+      <w:r>
+        <w:rPr>
+          <w:rStyle w:val="CodeChar"/>
+        </w:rPr>
+        <w:t xml:space="preserve">synapse_fanout</w:t>
+      </w:r>
+      <w:r>
+        <w:t xml:space="preserve"> + дубли генератора). В волне 1 эти ячейки не запускались, но в сетке 88 они есть.</w:t>
+      </w:r>
+    </w:p>
+    <w:p>
+      <w:pPr>
+        <w:pStyle w:val="ListParagraph"/>
+        <w:numPr>
+          <w:ilvl w:val="0"/>
+          <w:numId w:val="21"/>
+        </w:numPr>
+      </w:pPr>
+      <w:r>
+        <w:rPr>
+          <w:b/>
+        </w:rPr>
+        <w:t xml:space="preserve">Отбор G1 без положительных контролей.</w:t>
+      </w:r>
+      <w:r>
+        <w:t xml:space="preserve"> Мои правила отбора в карточке G1 (PSI off, ≤ 2 на ячейку) не требовали включать известные PASS. В G1 нет ни </w:t>
+      </w:r>
+      <w:r>
+        <w:rPr>
+          <w:rStyle w:val="CodeChar"/>
+        </w:rPr>
+        <w:t xml:space="preserve">br25_nextseg</w:t>
+      </w:r>
+      <w:r>
+        <w:t xml:space="preserve">, ни </w:t>
+      </w:r>
+      <w:r>
+        <w:rPr>
+          <w:rStyle w:val="CodeChar"/>
+        </w:rPr>
+        <w:t xml:space="preserve">br25_preinh</w:t>
+      </w:r>
+      <w:r>
+        <w:t xml:space="preserve">; вместо них взяты исторически провальные </w:t>
+      </w:r>
+      <w:r>
+        <w:rPr>
+          <w:rStyle w:val="CodeChar"/>
+        </w:rPr>
+        <w:t xml:space="preserve">br25_gen</w:t>
+      </w:r>
+      <w:r>
+        <w:t xml:space="preserve">/</w:t>
+      </w:r>
+      <w:r>
+        <w:rPr>
+          <w:rStyle w:val="CodeChar"/>
+        </w:rPr>
+        <w:t xml:space="preserve">br50_gen</w:t>
+      </w:r>
+      <w:r>
+        <w:t xml:space="preserve">. Отсутствие PASS в G1 ожидаемо и ничего не говорит о регрессии.</w:t>
+      </w:r>
+    </w:p>
+    <w:p>
+      <w:pPr>
+        <w:pStyle w:val="ListParagraph"/>
+        <w:numPr>
+          <w:ilvl w:val="0"/>
+          <w:numId w:val="21"/>
+        </w:numPr>
+      </w:pPr>
+      <w:r>
+        <w:rPr>
+          <w:b/>
+        </w:rPr>
+        <w:t xml:space="preserve">Ненулевой код очереди ≠ сбой.</w:t>
+      </w:r>
+      <w:r>
+        <w:t xml:space="preserve"> Очередь возвращает </w:t>
+      </w:r>
+      <w:r>
+        <w:rPr>
+          <w:rStyle w:val="CodeChar"/>
+        </w:rPr>
+        <w:t xml:space="preserve">launch.exit = 1</w:t>
+      </w:r>
+      <w:r>
+        <w:t xml:space="preserve">, если хоть один случай волны не сошёлся. Политика G1 исключила из метрик все случаи 10 из 13 волн, хотя у каждого случая есть свой </w:t>
+      </w:r>
+      <w:r>
+        <w:rPr>
+          <w:rStyle w:val="CodeChar"/>
+        </w:rPr>
+        <w:t xml:space="preserve">matrix_result.json</w:t>
+      </w:r>
+      <w:r>
+        <w:t xml:space="preserve">. Это потеря данных, а не ответ «не работает».</w:t>
+      </w:r>
+    </w:p>
+    <w:p>
+      <w:pPr>
+        <w:pStyle w:val="ListParagraph"/>
+        <w:numPr>
+          <w:ilvl w:val="0"/>
+          <w:numId w:val="21"/>
+        </w:numPr>
+      </w:pPr>
+      <w:r>
+        <w:rPr>
+          <w:b/>
+        </w:rPr>
+        <w:t xml:space="preserve">Silent-Test на сошедшихся Classic (W01/W13/W33: 7/8, цель не обнаружена).</w:t>
+      </w:r>
+      <w:r>
+        <w:t xml:space="preserve"> Train сходится, но PostTune при </w:t>
+      </w:r>
+      <w:r>
+        <w:rPr>
+          <w:rStyle w:val="CodeChar"/>
+        </w:rPr>
+        <w:t xml:space="preserve">NonSeparable</w:t>
+      </w:r>
+      <w:r>
+        <w:t xml:space="preserve"> ставит порог 1.0, и нейрон молчит. Это известный дефект политики порога (DEBT-D2), а не провал обучения. Сравнивать нужно с запасом </w:t>
+      </w:r>
+      <w:r>
+        <w:rPr>
+          <w:rStyle w:val="CodeChar"/>
+        </w:rPr>
+        <w:t xml:space="preserve">sep_margin</w:t>
+      </w:r>
+      <w:r>
+        <w:t xml:space="preserve">, а не с Acc.</w:t>
+      </w:r>
+    </w:p>
+    <w:p>
+      <w:pPr>
+        <w:pStyle w:val="ListParagraph"/>
+        <w:numPr>
+          <w:ilvl w:val="0"/>
+          <w:numId w:val="21"/>
+        </w:numPr>
+      </w:pPr>
+      <w:r>
+        <w:rPr>
+          <w:b/>
+        </w:rPr>
+        <w:t xml:space="preserve">Не проверено, что τ реально применился.</w:t>
+      </w:r>
+      <w:r>
+        <w:t xml:space="preserve"> В </w:t>
+      </w:r>
+      <w:r>
+        <w:rPr>
+          <w:rStyle w:val="CodeChar"/>
+        </w:rPr>
+        <w:t xml:space="preserve">Model_00.xml</w:t>
+      </w:r>
+      <w:r>
+        <w:t xml:space="preserve"> ячеек H0 у нейрона остаются </w:t>
+      </w:r>
+      <w:r>
+        <w:rPr>
+          <w:rStyle w:val="CodeChar"/>
+        </w:rPr>
+        <w:t xml:space="preserve">MembraneCapacity = 1e-9</w:t>
+      </w:r>
+      <w:r>
+        <w:t xml:space="preserve"> и </w:t>
+      </w:r>
+      <w:r>
+        <w:rPr>
+          <w:rStyle w:val="CodeChar"/>
+        </w:rPr>
+        <w:t xml:space="preserve">Capacity = 1e-9</w:t>
+      </w:r>
+      <w:r>
+        <w:t xml:space="preserve"> у всех каналов; сменено только имя класса. C++ при </w:t>
+      </w:r>
+      <w:r>
+        <w:rPr>
+          <w:rStyle w:val="CodeChar"/>
+        </w:rPr>
+        <w:t xml:space="preserve">BuildStructure</w:t>
+      </w:r>
+      <w:r>
+        <w:t xml:space="preserve"> пересоздаёт нейрон из класса, так что τ, вероятно, правильный. Но в evidence нет ни одной сохранённой модели с проверкой ёмкости после прогона.</w:t>
+      </w:r>
+    </w:p>
+    <w:p>
+      <w:pPr>
+        <w:pStyle w:val="Heading3"/>
+      </w:pPr>
+      <w:r>
+        <w:t xml:space="preserve">План исправлений (дешёвый, по порядку)</w:t>
+      </w:r>
+    </w:p>
+    <w:p>
+      <w:pPr>
+        <w:pStyle w:val="ListParagraph"/>
+        <w:numPr>
+          <w:ilvl w:val="0"/>
+          <w:numId w:val="22"/>
+        </w:numPr>
+      </w:pPr>
+      <w:r>
+        <w:rPr>
+          <w:b/>
+        </w:rPr>
+        <w:t xml:space="preserve">Пересчитать G1 по случаям</w:t>
+      </w:r>
+      <w:r>
+        <w:t xml:space="preserve"> (только чтение, 0 Console): </w:t>
+      </w:r>
+      <w:r>
+        <w:rPr>
+          <w:rStyle w:val="CodeChar"/>
+        </w:rPr>
+        <w:t xml:space="preserve">summarize_run.py</w:t>
+      </w:r>
+      <w:r>
+        <w:t xml:space="preserve"> по всем 10 волнам с exit ≠ 0. Классифицировать каждый случай по </w:t>
+      </w:r>
+      <w:r>
+        <w:rPr>
+          <w:rStyle w:val="CodeChar"/>
+        </w:rPr>
+        <w:t xml:space="preserve">training_convergence</w:t>
+      </w:r>
+      <w:r>
+        <w:t xml:space="preserve"> и </w:t>
+      </w:r>
+      <w:r>
+        <w:rPr>
+          <w:rStyle w:val="CodeChar"/>
+        </w:rPr>
+        <w:t xml:space="preserve">separation_quality</w:t>
+      </w:r>
+      <w:r>
+        <w:t xml:space="preserve">. Ожидаю, что часть «потерянных» строк — сошедшиеся случаи.</w:t>
+      </w:r>
+    </w:p>
+    <w:p>
+      <w:pPr>
+        <w:pStyle w:val="ListParagraph"/>
+        <w:numPr>
+          <w:ilvl w:val="0"/>
+          <w:numId w:val="22"/>
+        </w:numPr>
+      </w:pPr>
+      <w:r>
+        <w:rPr>
+          <w:b/>
+        </w:rPr>
+        <w:t xml:space="preserve">Вернуть положительные контроли</w:t>
+      </w:r>
+      <w:r>
+        <w:t xml:space="preserve"> в каждую сравнительную волну: </w:t>
+      </w:r>
+      <w:r>
+        <w:rPr>
+          <w:rStyle w:val="CodeChar"/>
+        </w:rPr>
+        <w:t xml:space="preserve">br25_nextseg</w:t>
+      </w:r>
+      <w:r>
+        <w:t xml:space="preserve">, </w:t>
+      </w:r>
+      <w:r>
+        <w:rPr>
+          <w:rStyle w:val="CodeChar"/>
+        </w:rPr>
+        <w:t xml:space="preserve">br25_preinh</w:t>
+      </w:r>
+      <w:r>
+        <w:t xml:space="preserve">, </w:t>
+      </w:r>
+      <w:r>
+        <w:rPr>
+          <w:rStyle w:val="CodeChar"/>
+        </w:rPr>
+        <w:t xml:space="preserve">br50_gen</w:t>
+      </w:r>
+      <w:r>
+        <w:t xml:space="preserve"> (legacy C1e9) плюс один Classic N0 Span 50. Правило: если контроль не прошёл, волна не интерпретируется.</w:t>
+      </w:r>
+    </w:p>
+    <w:p>
+      <w:pPr>
+        <w:pStyle w:val="ListParagraph"/>
+        <w:numPr>
+          <w:ilvl w:val="0"/>
+          <w:numId w:val="22"/>
+        </w:numPr>
+      </w:pPr>
+      <w:r>
+        <w:rPr>
+          <w:b/>
+        </w:rPr>
+        <w:t xml:space="preserve">Проверить ёмкость</w:t>
+      </w:r>
+      <w:r>
+        <w:t xml:space="preserve"> на одной сохранённой Train-модели H0b (S25 или S100): </w:t>
+      </w:r>
+      <w:r>
+        <w:rPr>
+          <w:rStyle w:val="CodeChar"/>
+        </w:rPr>
+        <w:t xml:space="preserve">grep Capacity</w:t>
+      </w:r>
+      <w:r>
+        <w:t xml:space="preserve"> должен дать </w:t>
+      </w:r>
+      <w:r>
+        <w:rPr>
+          <w:rStyle w:val="CodeChar"/>
+        </w:rPr>
+        <w:t xml:space="preserve">5e-11</w:t>
+      </w:r>
+      <w:r>
+        <w:t xml:space="preserve"> / </w:t>
+      </w:r>
+      <w:r>
+        <w:rPr>
+          <w:rStyle w:val="CodeChar"/>
+        </w:rPr>
+        <w:t xml:space="preserve">2.5e-10</w:t>
+      </w:r>
+      <w:r>
+        <w:t xml:space="preserve">. Если там </w:t>
+      </w:r>
+      <w:r>
+        <w:rPr>
+          <w:rStyle w:val="CodeChar"/>
+        </w:rPr>
+        <w:t xml:space="preserve">1e-9</w:t>
+      </w:r>
+      <w:r>
+        <w:t xml:space="preserve">, вся волна H0 недействительна.</w:t>
+      </w:r>
+    </w:p>
+    <w:p>
+      <w:pPr>
+        <w:pStyle w:val="ListParagraph"/>
+        <w:numPr>
+          <w:ilvl w:val="0"/>
+          <w:numId w:val="22"/>
+        </w:numPr>
+      </w:pPr>
+      <w:r>
+        <w:rPr>
+          <w:b/>
+        </w:rPr>
+        <w:t xml:space="preserve">Поправить H0-шаблоны</w:t>
+      </w:r>
+      <w:r>
+        <w:t xml:space="preserve"> (если H0 продолжать): </w:t>
+      </w:r>
+      <w:r>
+        <w:rPr>
+          <w:rStyle w:val="CodeChar"/>
+        </w:rPr>
+        <w:t xml:space="preserve">EstDelayPerSeg = τ</w:t>
+      </w:r>
+      <w:r>
+        <w:t xml:space="preserve"> у Classic (через </w:t>
+      </w:r>
+      <w:r>
+        <w:rPr>
+          <w:rStyle w:val="CodeChar"/>
+        </w:rPr>
+        <w:t xml:space="preserve">--train-param</w:t>
+      </w:r>
+      <w:r>
+        <w:t xml:space="preserve">); у Branch — влить </w:t>
+      </w:r>
+      <w:r>
+        <w:rPr>
+          <w:rStyle w:val="CodeChar"/>
+        </w:rPr>
+        <w:t xml:space="preserve">EstDelayPerSegInit</w:t>
+      </w:r>
+      <w:r>
+        <w:t xml:space="preserve"> (патч E1) и ставить τ. Test DefaultTimeStep = Train (20 кГц для τ ≤ 2.5 мс). Прогнать </w:t>
+      </w:r>
+      <w:r>
+        <w:rPr>
+          <w:rStyle w:val="CodeChar"/>
+        </w:rPr>
+        <w:t xml:space="preserve">check_model_wiring</w:t>
+      </w:r>
+      <w:r>
+        <w:t xml:space="preserve"> / </w:t>
+      </w:r>
+      <w:r>
+        <w:rPr>
+          <w:rStyle w:val="CodeChar"/>
+        </w:rPr>
+        <w:t xml:space="preserve">repair_model_wiring</w:t>
+      </w:r>
+      <w:r>
+        <w:t xml:space="preserve"> по всем </w:t>
+      </w:r>
+      <w:r>
+        <w:rPr>
+          <w:rStyle w:val="CodeChar"/>
+        </w:rPr>
+        <w:t xml:space="preserve">Selectivity*</w:t>
+      </w:r>
+      <w:r>
+        <w:t xml:space="preserve"> шаблонам, а не только по matrix.</w:t>
+      </w:r>
+    </w:p>
+    <w:p>
+      <w:pPr>
+        <w:pStyle w:val="ListParagraph"/>
+        <w:numPr>
+          <w:ilvl w:val="0"/>
+          <w:numId w:val="22"/>
+        </w:numPr>
+      </w:pPr>
+      <w:r>
+        <w:rPr>
+          <w:b/>
+        </w:rPr>
+        <w:t xml:space="preserve">Не запускать сетку 88 и H0 cold повторно</w:t>
+      </w:r>
+      <w:r>
+        <w:t xml:space="preserve">, пока не сделаны пункты 1–4. Смысл H0 после правки — только проверить пункт 2 раздела выше на 2–3 ячейках (S25, S100, Branch nextseg) с контролями.</w:t>
+      </w:r>
+    </w:p>
+    <w:p>
+      <w:pPr>
+        <w:pStyle w:val="ListParagraph"/>
+        <w:numPr>
+          <w:ilvl w:val="0"/>
+          <w:numId w:val="22"/>
+        </w:numPr>
+      </w:pPr>
+      <w:r>
+        <w:rPr>
+          <w:b/>
+        </w:rPr>
+        <w:t xml:space="preserve">Стратегически:</w:t>
+      </w:r>
+      <w:r>
+        <w:t xml:space="preserve"> запас разделимости ограничен физикой пассивного кабеля при любой τ. Улучшение возможно только за счёт носителя задержки без дисперсии (F1b: узкий EPSP + </w:t>
+      </w:r>
+      <w:r>
+        <w:rPr>
+          <w:rStyle w:val="CodeChar"/>
+        </w:rPr>
+        <w:t xml:space="preserve">NAxoneDelay</w:t>
+      </w:r>
+      <w:r>
+        <w:t xml:space="preserve">) или нелинейности. Поэтому следующий содержательный эксперимент — F1b с ручной задержкой на 25/50 мс (ожидаемый запас по модели 0.12/0.20), а не новая волна τ.</w:t>
+      </w:r>
+    </w:p>
+    <w:p>
+      <w:pPr>
+        <w:pStyle w:val="ListParagraph"/>
+        <w:numPr>
+          <w:ilvl w:val="0"/>
+          <w:numId w:val="22"/>
+        </w:numPr>
+      </w:pPr>
+      <w:r>
+        <w:rPr>
+          <w:b/>
+        </w:rPr>
+        <w:t xml:space="preserve">Silent-Test:</w:t>
+      </w:r>
+      <w:r>
+        <w:t xml:space="preserve"> для оценки качества временно использовать candidate-mid / </w:t>
+      </w:r>
+      <w:r>
+        <w:rPr>
+          <w:rStyle w:val="CodeChar"/>
+        </w:rPr>
+        <w:t xml:space="preserve">sep_margin</w:t>
+      </w:r>
+      <w:r>
+        <w:t xml:space="preserve"> (уже выводится с </w:t>
+      </w:r>
+      <w:r>
+        <w:rPr>
+          <w:rStyle w:val="CodeChar"/>
+        </w:rPr>
+        <w:t xml:space="preserve">9e3e584</w:t>
+      </w:r>
+      <w:r>
+        <w:t xml:space="preserve">/</w:t>
+      </w:r>
+      <w:r>
+        <w:rPr>
+          <w:rStyle w:val="CodeChar"/>
+        </w:rPr>
+        <w:t xml:space="preserve">5e5a59d</w:t>
+      </w:r>
+      <w:r>
+        <w:t xml:space="preserve">), а не порог 1.0 по умолчанию.</w:t>
+      </w:r>
+    </w:p>
+    <w:p>
+      <w:pPr>
+        <w:pStyle w:val="Heading2"/>
+      </w:pPr>
+      <w:r>
+        <w:t xml:space="preserve">Переформулировка задачи: когда запас разделимости положителен (23.10)</w:t>
+      </w:r>
+    </w:p>
+    <w:p>
+      <w:pPr/>
+      <w:r>
+        <w:t xml:space="preserve">Расчёт офлайн-моделью кабеля (</w:t>
+      </w:r>
+      <w:r>
+        <w:rPr>
+          <w:rStyle w:val="CodeChar"/>
+        </w:rPr>
+        <w:t xml:space="preserve">evidence/cable_model/margin_vs_shift.py</w:t>
+      </w:r>
+      <w:r>
+        <w:t xml:space="preserve">, линейная суперпозиция, амплитуды входов выровнены, пол Rs не учитывается). Запас m = (target − max foil)/target. Обозначения:</w:t>
+      </w:r>
+    </w:p>
+    <w:p>
+      <w:pPr>
+        <w:pStyle w:val="ListParagraph"/>
+        <w:numPr>
+          <w:ilvl w:val="0"/>
+          <w:numId w:val="23"/>
+        </w:numPr>
+      </w:pPr>
+      <w:r>
+        <w:t xml:space="preserve">m8 — штатный набор из 8 паттернов;</w:t>
+      </w:r>
+    </w:p>
+    <w:p>
+      <w:pPr>
+        <w:pStyle w:val="ListParagraph"/>
+        <w:numPr>
+          <w:ilvl w:val="0"/>
+          <w:numId w:val="23"/>
+        </w:numPr>
+      </w:pPr>
+      <w:r>
+        <w:t xml:space="preserve">m1(Δ) — синтетические foil'ы со сдвигом </w:t>
+      </w:r>
+      <w:r>
+        <w:rPr>
+          <w:b/>
+        </w:rPr>
+        <w:t xml:space="preserve">одного</w:t>
+      </w:r>
+      <w:r>
+        <w:t xml:space="preserve"> импульса на Δ, худший из 4 импульсов и обоих знаков;</w:t>
+      </w:r>
+    </w:p>
+    <w:p>
+      <w:pPr>
+        <w:pStyle w:val="ListParagraph"/>
+        <w:numPr>
+          <w:ilvl w:val="0"/>
+          <w:numId w:val="23"/>
+        </w:numPr>
+      </w:pPr>
+      <w:r>
+        <w:t xml:space="preserve">m2(W) — сдвиг </w:t>
+      </w:r>
+      <w:r>
+        <w:rPr>
+          <w:b/>
+        </w:rPr>
+        <w:t xml:space="preserve">двух</w:t>
+      </w:r>
+      <w:r>
+        <w:t xml:space="preserve"> импульсов на W;</w:t>
+      </w:r>
+    </w:p>
+    <w:p>
+      <w:pPr>
+        <w:pStyle w:val="ListParagraph"/>
+        <w:numPr>
+          <w:ilvl w:val="0"/>
+          <w:numId w:val="23"/>
+        </w:numPr>
+      </w:pPr>
+      <w:r>
+        <w:t xml:space="preserve">W — FWHM EPSP самого длинного дендрита.</w:t>
+      </w:r>
+    </w:p>
+    <w:p>
+      <w:pPr>
+        <w:pStyle w:val="Heading3"/>
+      </w:pPr>
+      <w:r>
+        <w:t xml:space="preserve">Важная поправка к прежней оценке</w:t>
+      </w:r>
+    </w:p>
+    <w:p>
+      <w:pPr/>
+      <w:r>
+        <w:t xml:space="preserve">В текущей топологии (Classic и Branch) </w:t>
+      </w:r>
+      <w:r>
+        <w:rPr>
+          <w:b/>
+        </w:rPr>
+        <w:t xml:space="preserve">один генератор подаёт весь паттерн на кончики всех дендритов</w:t>
+      </w:r>
+      <w:r>
+        <w:t xml:space="preserve">: каждый дендрит получает все 4 импульса. Поэтому foil набирает не только 3 совпадения, но и перекрёстные члены (дендрит k + импульс j ≠ k). Прежняя формула m = (1 − k(Δ))/4 верна только для схемы «импульс k приходит лишь на дендрит k». На одной линии увеличение сдвига почти не помогает: m1 остаётся отрицательным вплоть до Δ ≈ span и положительным становится только при Δ ≳ 2W, то есть за пределами паттерна. </w:t>
+      </w:r>
+      <w:r>
+        <w:rPr>
+          <w:b/>
+        </w:rPr>
+        <w:t xml:space="preserve">Переформулировка «просто увеличить Δ» в текущей топологии не работает.</w:t>
+      </w:r>
+    </w:p>
+    <w:p>
+      <w:pPr>
+        <w:pStyle w:val="Heading3"/>
+      </w:pPr>
+      <w:r>
+        <w:t xml:space="preserve">Таблица 1. Текущая постановка (одна входная линия)</w:t>
+      </w:r>
+    </w:p>
+    <w:tbl>
+      <w:tblPr>
+        <w:tblStyle w:val="TableGrid"/>
+        <w:tblW w:w="0" w:type="auto"/>
+        <w:tblLayout w:type="fixed"/>
+        <w:tblLook w:val="04A0" w:firstRow="1" w:lastRow="0" w:firstColumn="0" w:lastColumn="0" w:noHBand="0" w:noVBand="1"/>
+      </w:tblPr>
+      <w:tblGrid>
+        <w:gridCol w:w="1400"/>
+        <w:gridCol w:w="829"/>
+        <w:gridCol w:w="1390"/>
+        <w:gridCol w:w="1170"/>
+        <w:gridCol w:w="1113"/>
+        <w:gridCol w:w="1097"/>
+        <w:gridCol w:w="1097"/>
+        <w:gridCol w:w="1264"/>
+      </w:tblGrid>
+      <w:tr>
+        <w:trPr>
+          <w:tblHeader/>
+        </w:trPr>
+        <w:tc>
+          <w:tcPr>
+            <w:tcW w:w="1400" w:type="dxa"/>
+            <w:shd w:val="clear" w:color="auto" w:fill="F2F2F2"/>
+          </w:tcPr>
+          <w:p>
+            <w:pPr/>
+            <w:r>
+              <w:t xml:space="preserve">Модель</w:t>
+            </w:r>
+          </w:p>
+        </w:tc>
+        <w:tc>
+          <w:tcPr>
+            <w:tcW w:w="829" w:type="dxa"/>
+            <w:shd w:val="clear" w:color="auto" w:fill="F2F2F2"/>
+          </w:tcPr>
+          <w:p>
+            <w:pPr/>
+            <w:r>
+              <w:t xml:space="preserve">Span, мс</w:t>
+            </w:r>
+          </w:p>
+        </w:tc>
+        <w:tc>
+          <w:tcPr>
+            <w:tcW w:w="1390" w:type="dxa"/>
+            <w:shd w:val="clear" w:color="auto" w:fill="F2F2F2"/>
+          </w:tcPr>
+          <w:p>
+            <w:pPr/>
+            <w:r>
+              <w:t xml:space="preserve">m8</w:t>
+            </w:r>
+          </w:p>
+        </w:tc>
+        <w:tc>
+          <w:tcPr>
+            <w:tcW w:w="1170" w:type="dxa"/>
+            <w:shd w:val="clear" w:color="auto" w:fill="F2F2F2"/>
+          </w:tcPr>
+          <w:p>
+            <w:pPr/>
+            <w:r>
+              <w:t xml:space="preserve">m1(S/24)</w:t>
+            </w:r>
+          </w:p>
+        </w:tc>
+        <w:tc>
+          <w:tcPr>
+            <w:tcW w:w="1113" w:type="dxa"/>
+            <w:shd w:val="clear" w:color="auto" w:fill="F2F2F2"/>
+          </w:tcPr>
+          <w:p>
+            <w:pPr/>
+            <w:r>
+              <w:t xml:space="preserve">m1(S/4)</w:t>
+            </w:r>
+          </w:p>
+        </w:tc>
+        <w:tc>
+          <w:tcPr>
+            <w:tcW w:w="1097" w:type="dxa"/>
+            <w:shd w:val="clear" w:color="auto" w:fill="F2F2F2"/>
+          </w:tcPr>
+          <w:p>
+            <w:pPr/>
+            <w:r>
+              <w:t xml:space="preserve">m1(W)</w:t>
+            </w:r>
+          </w:p>
+        </w:tc>
+        <w:tc>
+          <w:tcPr>
+            <w:tcW w:w="1097" w:type="dxa"/>
+            <w:shd w:val="clear" w:color="auto" w:fill="F2F2F2"/>
+          </w:tcPr>
+          <w:p>
+            <w:pPr/>
+            <w:r>
+              <w:t xml:space="preserve">m2(W)</w:t>
+            </w:r>
+          </w:p>
+        </w:tc>
+        <w:tc>
+          <w:tcPr>
+            <w:tcW w:w="1264" w:type="dxa"/>
+            <w:shd w:val="clear" w:color="auto" w:fill="F2F2F2"/>
+          </w:tcPr>
+          <w:p>
+            <w:pPr/>
+            <w:r>
+              <w:t xml:space="preserve">Лучший exc+inh, m8</w:t>
+            </w:r>
+          </w:p>
+        </w:tc>
+      </w:tr>
+      <w:tr>
+        <w:tc>
+          <w:tcPr>
+            <w:tcW w:w="1400" w:type="dxa"/>
+          </w:tcPr>
+          <w:p>
+            <w:pPr/>
+            <w:r>
+              <w:t xml:space="preserve">NSPNeuronGen τ=10 мс, D=5</w:t>
+            </w:r>
+          </w:p>
+        </w:tc>
+        <w:tc>
+          <w:tcPr>
+            <w:tcW w:w="829" w:type="dxa"/>
+          </w:tcPr>
+          <w:p>
+            <w:pPr/>
+            <w:r>
+              <w:t xml:space="preserve">25</w:t>
+            </w:r>
+          </w:p>
+        </w:tc>
+        <w:tc>
+          <w:tcPr>
+            <w:tcW w:w="1390" w:type="dxa"/>
+          </w:tcPr>
+          <w:p>
+            <w:pPr/>
+            <w:r>
+              <w:t xml:space="preserve">−2.0%</w:t>
+            </w:r>
+          </w:p>
+        </w:tc>
+        <w:tc>
+          <w:tcPr>
+            <w:tcW w:w="1170" w:type="dxa"/>
+          </w:tcPr>
+          <w:p>
+            <w:pPr/>
+            <w:r>
+              <w:t xml:space="preserve">−0.9%</w:t>
+            </w:r>
+          </w:p>
+        </w:tc>
+        <w:tc>
+          <w:tcPr>
+            <w:tcW w:w="1113" w:type="dxa"/>
+          </w:tcPr>
+          <w:p>
+            <w:pPr/>
+            <w:r>
+              <w:t xml:space="preserve">−4.9%</w:t>
+            </w:r>
+          </w:p>
+        </w:tc>
+        <w:tc>
+          <w:tcPr>
+            <w:tcW w:w="1097" w:type="dxa"/>
+          </w:tcPr>
+          <w:p>
+            <w:pPr/>
+            <w:r>
+              <w:t xml:space="preserve">+4.5%</w:t>
+            </w:r>
+          </w:p>
+        </w:tc>
+        <w:tc>
+          <w:tcPr>
+            <w:tcW w:w="1097" w:type="dxa"/>
+          </w:tcPr>
+          <w:p>
+            <w:pPr/>
+            <w:r>
+              <w:t xml:space="preserve">+14.8%</w:t>
+            </w:r>
+          </w:p>
+        </w:tc>
+        <w:tc>
+          <w:tcPr>
+            <w:tcW w:w="1264" w:type="dxa"/>
+          </w:tcPr>
+          <w:p>
+            <w:pPr/>
+            <w:r>
+              <w:t xml:space="preserve">−1.5%</w:t>
+            </w:r>
+          </w:p>
+        </w:tc>
+      </w:tr>
+      <w:tr>
+        <w:tc>
+          <w:tcPr>
+            <w:tcW w:w="1400" w:type="dxa"/>
+          </w:tcPr>
+          <w:p>
+            <w:pPr/>
+          </w:p>
+        </w:tc>
+        <w:tc>
+          <w:tcPr>
+            <w:tcW w:w="829" w:type="dxa"/>
+          </w:tcPr>
+          <w:p>
+            <w:pPr/>
+            <w:r>
+              <w:t xml:space="preserve">50</w:t>
+            </w:r>
+          </w:p>
+        </w:tc>
+        <w:tc>
+          <w:tcPr>
+            <w:tcW w:w="1390" w:type="dxa"/>
+          </w:tcPr>
+          <w:p>
+            <w:pPr/>
+            <w:r>
+              <w:t xml:space="preserve">−3.8%</w:t>
+            </w:r>
+          </w:p>
+        </w:tc>
+        <w:tc>
+          <w:tcPr>
+            <w:tcW w:w="1170" w:type="dxa"/>
+          </w:tcPr>
+          <w:p>
+            <w:pPr/>
+            <w:r>
+              <w:t xml:space="preserve">−1.1%</w:t>
+            </w:r>
+          </w:p>
+        </w:tc>
+        <w:tc>
+          <w:tcPr>
+            <w:tcW w:w="1113" w:type="dxa"/>
+          </w:tcPr>
+          <w:p>
+            <w:pPr/>
+            <w:r>
+              <w:t xml:space="preserve">−8.0%</w:t>
+            </w:r>
+          </w:p>
+        </w:tc>
+        <w:tc>
+          <w:tcPr>
+            <w:tcW w:w="1097" w:type="dxa"/>
+          </w:tcPr>
+          <w:p>
+            <w:pPr/>
+            <w:r>
+              <w:t xml:space="preserve">−12.0%</w:t>
+            </w:r>
+          </w:p>
+        </w:tc>
+        <w:tc>
+          <w:tcPr>
+            <w:tcW w:w="1097" w:type="dxa"/>
+          </w:tcPr>
+          <w:p>
+            <w:pPr/>
+            <w:r>
+              <w:t xml:space="preserve">−7.6%</w:t>
+            </w:r>
+          </w:p>
+        </w:tc>
+        <w:tc>
+          <w:tcPr>
+            <w:tcW w:w="1264" w:type="dxa"/>
+          </w:tcPr>
+          <w:p>
+            <w:pPr/>
+            <w:r>
+              <w:t xml:space="preserve">−1.4%</w:t>
+            </w:r>
+          </w:p>
+        </w:tc>
+      </w:tr>
+      <w:tr>
+        <w:tc>
+          <w:tcPr>
+            <w:tcW w:w="1400" w:type="dxa"/>
+          </w:tcPr>
+          <w:p>
+            <w:pPr/>
+          </w:p>
+        </w:tc>
+        <w:tc>
+          <w:tcPr>
+            <w:tcW w:w="829" w:type="dxa"/>
+          </w:tcPr>
+          <w:p>
+            <w:pPr/>
+            <w:r>
+              <w:t xml:space="preserve">100</w:t>
+            </w:r>
+          </w:p>
+        </w:tc>
+        <w:tc>
+          <w:tcPr>
+            <w:tcW w:w="1390" w:type="dxa"/>
+          </w:tcPr>
+          <w:p>
+            <w:pPr/>
+            <w:r>
+              <w:t xml:space="preserve">−7.4%</w:t>
+            </w:r>
+          </w:p>
+        </w:tc>
+        <w:tc>
+          <w:tcPr>
+            <w:tcW w:w="1170" w:type="dxa"/>
+          </w:tcPr>
+          <w:p>
+            <w:pPr/>
+            <w:r>
+              <w:t xml:space="preserve">−2.0%</w:t>
+            </w:r>
+          </w:p>
+        </w:tc>
+        <w:tc>
+          <w:tcPr>
+            <w:tcW w:w="1113" w:type="dxa"/>
+          </w:tcPr>
+          <w:p>
+            <w:pPr/>
+            <w:r>
+              <w:t xml:space="preserve">−8.2%</w:t>
+            </w:r>
+          </w:p>
+        </w:tc>
+        <w:tc>
+          <w:tcPr>
+            <w:tcW w:w="1097" w:type="dxa"/>
+          </w:tcPr>
+          <w:p>
+            <w:pPr/>
+            <w:r>
+              <w:t xml:space="preserve">−19.1%</w:t>
+            </w:r>
+          </w:p>
+        </w:tc>
+        <w:tc>
+          <w:tcPr>
+            <w:tcW w:w="1097" w:type="dxa"/>
+          </w:tcPr>
+          <w:p>
+            <w:pPr/>
+            <w:r>
+              <w:t xml:space="preserve">−17.7%</w:t>
+            </w:r>
+          </w:p>
+        </w:tc>
+        <w:tc>
+          <w:tcPr>
+            <w:tcW w:w="1264" w:type="dxa"/>
+          </w:tcPr>
+          <w:p>
+            <w:pPr/>
+            <w:r>
+              <w:t xml:space="preserve">−0.8%</w:t>
+            </w:r>
+          </w:p>
+        </w:tc>
+      </w:tr>
+      <w:tr>
+        <w:tc>
+          <w:tcPr>
+            <w:tcW w:w="1400" w:type="dxa"/>
+          </w:tcPr>
+          <w:p>
+            <w:pPr/>
+          </w:p>
+        </w:tc>
+        <w:tc>
+          <w:tcPr>
+            <w:tcW w:w="829" w:type="dxa"/>
+          </w:tcPr>
+          <w:p>
+            <w:pPr/>
+            <w:r>
+              <w:t xml:space="preserve">480</w:t>
+            </w:r>
+          </w:p>
+        </w:tc>
+        <w:tc>
+          <w:tcPr>
+            <w:tcW w:w="1390" w:type="dxa"/>
+          </w:tcPr>
+          <w:p>
+            <w:pPr/>
+            <w:r>
+              <w:t xml:space="preserve">−13.2%</w:t>
+            </w:r>
+          </w:p>
+        </w:tc>
+        <w:tc>
+          <w:tcPr>
+            <w:tcW w:w="1170" w:type="dxa"/>
+          </w:tcPr>
+          <w:p>
+            <w:pPr/>
+            <w:r>
+              <w:t xml:space="preserve">−2.8%</w:t>
+            </w:r>
+          </w:p>
+        </w:tc>
+        <w:tc>
+          <w:tcPr>
+            <w:tcW w:w="1113" w:type="dxa"/>
+          </w:tcPr>
+          <w:p>
+            <w:pPr/>
+            <w:r>
+              <w:t xml:space="preserve">−2.4%</w:t>
+            </w:r>
+          </w:p>
+        </w:tc>
+        <w:tc>
+          <w:tcPr>
+            <w:tcW w:w="1097" w:type="dxa"/>
+          </w:tcPr>
+          <w:p>
+            <w:pPr/>
+            <w:r>
+              <w:t xml:space="preserve">−11.1%</w:t>
+            </w:r>
+          </w:p>
+        </w:tc>
+        <w:tc>
+          <w:tcPr>
+            <w:tcW w:w="1097" w:type="dxa"/>
+          </w:tcPr>
+          <w:p>
+            <w:pPr/>
+            <w:r>
+              <w:t xml:space="preserve">−3.4%</w:t>
+            </w:r>
+          </w:p>
+        </w:tc>
+        <w:tc>
+          <w:tcPr>
+            <w:tcW w:w="1264" w:type="dxa"/>
+          </w:tcPr>
+          <w:p>
+            <w:pPr/>
+            <w:r>
+              <w:t xml:space="preserve">−5.8%</w:t>
+            </w:r>
+          </w:p>
+        </w:tc>
+      </w:tr>
+      <w:tr>
+        <w:tc>
+          <w:tcPr>
+            <w:tcW w:w="1400" w:type="dxa"/>
+          </w:tcPr>
+          <w:p>
+            <w:pPr/>
+            <w:r>
+              <w:t xml:space="preserve">AsymRm τ=10 мс, D=1 (τ_inh = 100 мс)</w:t>
+            </w:r>
+          </w:p>
+        </w:tc>
+        <w:tc>
+          <w:tcPr>
+            <w:tcW w:w="829" w:type="dxa"/>
+          </w:tcPr>
+          <w:p>
+            <w:pPr/>
+            <w:r>
+              <w:t xml:space="preserve">25</w:t>
+            </w:r>
+          </w:p>
+        </w:tc>
+        <w:tc>
+          <w:tcPr>
+            <w:tcW w:w="1390" w:type="dxa"/>
+          </w:tcPr>
+          <w:p>
+            <w:pPr/>
+            <w:r>
+              <w:t xml:space="preserve">−2.2%</w:t>
+            </w:r>
+          </w:p>
+        </w:tc>
+        <w:tc>
+          <w:tcPr>
+            <w:tcW w:w="1170" w:type="dxa"/>
+          </w:tcPr>
+          <w:p>
+            <w:pPr/>
+            <w:r>
+              <w:t xml:space="preserve">−1.0%</w:t>
+            </w:r>
+          </w:p>
+        </w:tc>
+        <w:tc>
+          <w:tcPr>
+            <w:tcW w:w="1113" w:type="dxa"/>
+          </w:tcPr>
+          <w:p>
+            <w:pPr/>
+            <w:r>
+              <w:t xml:space="preserve">−5.1%</w:t>
+            </w:r>
+          </w:p>
+        </w:tc>
+        <w:tc>
+          <w:tcPr>
+            <w:tcW w:w="1097" w:type="dxa"/>
+          </w:tcPr>
+          <w:p>
+            <w:pPr/>
+            <w:r>
+              <w:t xml:space="preserve">+3.6%</w:t>
+            </w:r>
+          </w:p>
+        </w:tc>
+        <w:tc>
+          <w:tcPr>
+            <w:tcW w:w="1097" w:type="dxa"/>
+          </w:tcPr>
+          <w:p>
+            <w:pPr/>
+            <w:r>
+              <w:t xml:space="preserve">+13.3%</w:t>
+            </w:r>
+          </w:p>
+        </w:tc>
+        <w:tc>
+          <w:tcPr>
+            <w:tcW w:w="1264" w:type="dxa"/>
+          </w:tcPr>
+          <w:p>
+            <w:pPr/>
+            <w:r>
+              <w:t xml:space="preserve">−2.1%</w:t>
+            </w:r>
+          </w:p>
+        </w:tc>
+      </w:tr>
+      <w:tr>
+        <w:tc>
+          <w:tcPr>
+            <w:tcW w:w="1400" w:type="dxa"/>
+          </w:tcPr>
+          <w:p>
+            <w:pPr/>
+          </w:p>
+        </w:tc>
+        <w:tc>
+          <w:tcPr>
+            <w:tcW w:w="829" w:type="dxa"/>
+          </w:tcPr>
+          <w:p>
+            <w:pPr/>
+            <w:r>
+              <w:t xml:space="preserve">100</w:t>
+            </w:r>
+          </w:p>
+        </w:tc>
+        <w:tc>
+          <w:tcPr>
+            <w:tcW w:w="1390" w:type="dxa"/>
+          </w:tcPr>
+          <w:p>
+            <w:pPr/>
+            <w:r>
+              <w:t xml:space="preserve">−7.9%</w:t>
+            </w:r>
+          </w:p>
+        </w:tc>
+        <w:tc>
+          <w:tcPr>
+            <w:tcW w:w="1170" w:type="dxa"/>
+          </w:tcPr>
+          <w:p>
+            <w:pPr/>
+            <w:r>
+              <w:t xml:space="preserve">−2.1%</w:t>
+            </w:r>
+          </w:p>
+        </w:tc>
+        <w:tc>
+          <w:tcPr>
+            <w:tcW w:w="1113" w:type="dxa"/>
+          </w:tcPr>
+          <w:p>
+            <w:pPr/>
+            <w:r>
+              <w:t xml:space="preserve">−8.7%</w:t>
+            </w:r>
+          </w:p>
+        </w:tc>
+        <w:tc>
+          <w:tcPr>
+            <w:tcW w:w="1097" w:type="dxa"/>
+          </w:tcPr>
+          <w:p>
+            <w:pPr/>
+            <w:r>
+              <w:t xml:space="preserve">−19.2%</w:t>
+            </w:r>
+          </w:p>
+        </w:tc>
+        <w:tc>
+          <w:tcPr>
+            <w:tcW w:w="1097" w:type="dxa"/>
+          </w:tcPr>
+          <w:p>
+            <w:pPr/>
+            <w:r>
+              <w:t xml:space="preserve">−17.9%</w:t>
+            </w:r>
+          </w:p>
+        </w:tc>
+        <w:tc>
+          <w:tcPr>
+            <w:tcW w:w="1264" w:type="dxa"/>
+          </w:tcPr>
+          <w:p>
+            <w:pPr/>
+            <w:r>
+              <w:t xml:space="preserve">−2.6%</w:t>
+            </w:r>
+          </w:p>
+        </w:tc>
+      </w:tr>
+      <w:tr>
+        <w:tc>
+          <w:tcPr>
+            <w:tcW w:w="1400" w:type="dxa"/>
+          </w:tcPr>
+          <w:p>
+            <w:pPr/>
+          </w:p>
+        </w:tc>
+        <w:tc>
+          <w:tcPr>
+            <w:tcW w:w="829" w:type="dxa"/>
+          </w:tcPr>
+          <w:p>
+            <w:pPr/>
+            <w:r>
+              <w:t xml:space="preserve">480</w:t>
+            </w:r>
+          </w:p>
+        </w:tc>
+        <w:tc>
+          <w:tcPr>
+            <w:tcW w:w="1390" w:type="dxa"/>
+          </w:tcPr>
+          <w:p>
+            <w:pPr/>
+            <w:r>
+              <w:t xml:space="preserve">−13.2%</w:t>
+            </w:r>
+          </w:p>
+        </w:tc>
+        <w:tc>
+          <w:tcPr>
+            <w:tcW w:w="1170" w:type="dxa"/>
+          </w:tcPr>
+          <w:p>
+            <w:pPr/>
+            <w:r>
+              <w:t xml:space="preserve">−2.8%</w:t>
+            </w:r>
+          </w:p>
+        </w:tc>
+        <w:tc>
+          <w:tcPr>
+            <w:tcW w:w="1113" w:type="dxa"/>
+          </w:tcPr>
+          <w:p>
+            <w:pPr/>
+            <w:r>
+              <w:t xml:space="preserve">−2.2%</w:t>
+            </w:r>
+          </w:p>
+        </w:tc>
+        <w:tc>
+          <w:tcPr>
+            <w:tcW w:w="1097" w:type="dxa"/>
+          </w:tcPr>
+          <w:p>
+            <w:pPr/>
+            <w:r>
+              <w:t xml:space="preserve">−10.9%</w:t>
+            </w:r>
+          </w:p>
+        </w:tc>
+        <w:tc>
+          <w:tcPr>
+            <w:tcW w:w="1097" w:type="dxa"/>
+          </w:tcPr>
+          <w:p>
+            <w:pPr/>
+            <w:r>
+              <w:t xml:space="preserve">−3.2%</w:t>
+            </w:r>
+          </w:p>
+        </w:tc>
+        <w:tc>
+          <w:tcPr>
+            <w:tcW w:w="1264" w:type="dxa"/>
+          </w:tcPr>
+          <w:p>
+            <w:pPr/>
+            <w:r>
+              <w:t xml:space="preserve">−4.7%</w:t>
+            </w:r>
+          </w:p>
+        </w:tc>
+      </w:tr>
+      <w:tr>
+        <w:tc>
+          <w:tcPr>
+            <w:tcW w:w="1400" w:type="dxa"/>
+          </w:tcPr>
+          <w:p>
+            <w:pPr/>
+            <w:r>
+              <w:t xml:space="preserve">FastSpan τ=2.5 мс, D=2</w:t>
+            </w:r>
+          </w:p>
+        </w:tc>
+        <w:tc>
+          <w:tcPr>
+            <w:tcW w:w="829" w:type="dxa"/>
+          </w:tcPr>
+          <w:p>
+            <w:pPr/>
+            <w:r>
+              <w:t xml:space="preserve">25</w:t>
+            </w:r>
+          </w:p>
+        </w:tc>
+        <w:tc>
+          <w:tcPr>
+            <w:tcW w:w="1390" w:type="dxa"/>
+          </w:tcPr>
+          <w:p>
+            <w:pPr/>
+            <w:r>
+              <w:t xml:space="preserve">−9.0%</w:t>
+            </w:r>
+          </w:p>
+        </w:tc>
+        <w:tc>
+          <w:tcPr>
+            <w:tcW w:w="1170" w:type="dxa"/>
+          </w:tcPr>
+          <w:p>
+            <w:pPr/>
+            <w:r>
+              <w:t xml:space="preserve">−1.8%</w:t>
+            </w:r>
+          </w:p>
+        </w:tc>
+        <w:tc>
+          <w:tcPr>
+            <w:tcW w:w="1113" w:type="dxa"/>
+          </w:tcPr>
+          <w:p>
+            <w:pPr/>
+            <w:r>
+              <w:t xml:space="preserve">−8.5%</w:t>
+            </w:r>
+          </w:p>
+        </w:tc>
+        <w:tc>
+          <w:tcPr>
+            <w:tcW w:w="1097" w:type="dxa"/>
+          </w:tcPr>
+          <w:p>
+            <w:pPr/>
+            <w:r>
+              <w:t xml:space="preserve">−18.8%</w:t>
+            </w:r>
+          </w:p>
+        </w:tc>
+        <w:tc>
+          <w:tcPr>
+            <w:tcW w:w="1097" w:type="dxa"/>
+          </w:tcPr>
+          <w:p>
+            <w:pPr/>
+            <w:r>
+              <w:t xml:space="preserve">−16.7%</w:t>
+            </w:r>
+          </w:p>
+        </w:tc>
+        <w:tc>
+          <w:tcPr>
+            <w:tcW w:w="1264" w:type="dxa"/>
+          </w:tcPr>
+          <w:p>
+            <w:pPr/>
+            <w:r>
+              <w:t xml:space="preserve">−0.4%</w:t>
+            </w:r>
+          </w:p>
+        </w:tc>
+      </w:tr>
+      <w:tr>
+        <w:tc>
+          <w:tcPr>
+            <w:tcW w:w="1400" w:type="dxa"/>
+          </w:tcPr>
+          <w:p>
+            <w:pPr/>
+          </w:p>
+        </w:tc>
+        <w:tc>
+          <w:tcPr>
+            <w:tcW w:w="829" w:type="dxa"/>
+          </w:tcPr>
+          <w:p>
+            <w:pPr/>
+            <w:r>
+              <w:t xml:space="preserve">50</w:t>
+            </w:r>
+          </w:p>
+        </w:tc>
+        <w:tc>
+          <w:tcPr>
+            <w:tcW w:w="1390" w:type="dxa"/>
+          </w:tcPr>
+          <w:p>
+            <w:pPr/>
+            <w:r>
+              <w:t xml:space="preserve">−12.8%</w:t>
+            </w:r>
+          </w:p>
+        </w:tc>
+        <w:tc>
+          <w:tcPr>
+            <w:tcW w:w="1170" w:type="dxa"/>
+          </w:tcPr>
+          <w:p>
+            <w:pPr/>
+            <w:r>
+              <w:t xml:space="preserve">−2.0%</w:t>
+            </w:r>
+          </w:p>
+        </w:tc>
+        <w:tc>
+          <w:tcPr>
+            <w:tcW w:w="1113" w:type="dxa"/>
+          </w:tcPr>
+          <w:p>
+            <w:pPr/>
+            <w:r>
+              <w:t xml:space="preserve">−10.5%</w:t>
+            </w:r>
+          </w:p>
+        </w:tc>
+        <w:tc>
+          <w:tcPr>
+            <w:tcW w:w="1097" w:type="dxa"/>
+          </w:tcPr>
+          <w:p>
+            <w:pPr/>
+            <w:r>
+              <w:t xml:space="preserve">−7.7%</w:t>
+            </w:r>
+          </w:p>
+        </w:tc>
+        <w:tc>
+          <w:tcPr>
+            <w:tcW w:w="1097" w:type="dxa"/>
+          </w:tcPr>
+          <w:p>
+            <w:pPr/>
+            <w:r>
+              <w:t xml:space="preserve">−18.2%</w:t>
+            </w:r>
+          </w:p>
+        </w:tc>
+        <w:tc>
+          <w:tcPr>
+            <w:tcW w:w="1264" w:type="dxa"/>
+          </w:tcPr>
+          <w:p>
+            <w:pPr/>
+            <w:r>
+              <w:t xml:space="preserve">−0.8%</w:t>
+            </w:r>
+          </w:p>
+        </w:tc>
+      </w:tr>
+      <w:tr>
+        <w:tc>
+          <w:tcPr>
+            <w:tcW w:w="1400" w:type="dxa"/>
+          </w:tcPr>
+          <w:p>
+            <w:pPr/>
+          </w:p>
+        </w:tc>
+        <w:tc>
+          <w:tcPr>
+            <w:tcW w:w="829" w:type="dxa"/>
+          </w:tcPr>
+          <w:p>
+            <w:pPr/>
+            <w:r>
+              <w:t xml:space="preserve">100</w:t>
+            </w:r>
+          </w:p>
+        </w:tc>
+        <w:tc>
+          <w:tcPr>
+            <w:tcW w:w="1390" w:type="dxa"/>
+          </w:tcPr>
+          <w:p>
+            <w:pPr/>
+            <w:r>
+              <w:t xml:space="preserve">−13.5%</w:t>
+            </w:r>
+          </w:p>
+        </w:tc>
+        <w:tc>
+          <w:tcPr>
+            <w:tcW w:w="1170" w:type="dxa"/>
+          </w:tcPr>
+          <w:p>
+            <w:pPr/>
+            <w:r>
+              <w:t xml:space="preserve">−2.3%</w:t>
+            </w:r>
+          </w:p>
+        </w:tc>
+        <w:tc>
+          <w:tcPr>
+            <w:tcW w:w="1113" w:type="dxa"/>
+          </w:tcPr>
+          <w:p>
+            <w:pPr/>
+            <w:r>
+              <w:t xml:space="preserve">−3.9%</w:t>
+            </w:r>
+          </w:p>
+        </w:tc>
+        <w:tc>
+          <w:tcPr>
+            <w:tcW w:w="1097" w:type="dxa"/>
+          </w:tcPr>
+          <w:p>
+            <w:pPr/>
+            <w:r>
+              <w:t xml:space="preserve">−13.0%</w:t>
+            </w:r>
+          </w:p>
+        </w:tc>
+        <w:tc>
+          <w:tcPr>
+            <w:tcW w:w="1097" w:type="dxa"/>
+          </w:tcPr>
+          <w:p>
+            <w:pPr/>
+            <w:r>
+              <w:t xml:space="preserve">−9.2%</w:t>
+            </w:r>
+          </w:p>
+        </w:tc>
+        <w:tc>
+          <w:tcPr>
+            <w:tcW w:w="1264" w:type="dxa"/>
+          </w:tcPr>
+          <w:p>
+            <w:pPr/>
+            <w:r>
+              <w:t xml:space="preserve">−5.3%</w:t>
+            </w:r>
+          </w:p>
+        </w:tc>
+      </w:tr>
+      <w:tr>
+        <w:tc>
+          <w:tcPr>
+            <w:tcW w:w="1400" w:type="dxa"/>
+          </w:tcPr>
+          <w:p>
+            <w:pPr/>
+          </w:p>
+        </w:tc>
+        <w:tc>
+          <w:tcPr>
+            <w:tcW w:w="829" w:type="dxa"/>
+          </w:tcPr>
+          <w:p>
+            <w:pPr/>
+            <w:r>
+              <w:t xml:space="preserve">480</w:t>
+            </w:r>
+          </w:p>
+        </w:tc>
+        <w:tc>
+          <w:tcPr>
+            <w:tcW w:w="1390" w:type="dxa"/>
+          </w:tcPr>
+          <w:p>
+            <w:pPr/>
+            <w:r>
+              <w:t xml:space="preserve">недостижимо (L &gt; 100)</w:t>
+            </w:r>
+          </w:p>
+        </w:tc>
+        <w:tc>
+          <w:tcPr>
+            <w:tcW w:w="1170" w:type="dxa"/>
+          </w:tcPr>
+          <w:p>
+            <w:pPr/>
+          </w:p>
+        </w:tc>
+        <w:tc>
+          <w:tcPr>
+            <w:tcW w:w="1113" w:type="dxa"/>
+          </w:tcPr>
+          <w:p>
+            <w:pPr/>
+          </w:p>
+        </w:tc>
+        <w:tc>
+          <w:tcPr>
+            <w:tcW w:w="1097" w:type="dxa"/>
+          </w:tcPr>
+          <w:p>
+            <w:pPr/>
+          </w:p>
+        </w:tc>
+        <w:tc>
+          <w:tcPr>
+            <w:tcW w:w="1097" w:type="dxa"/>
+          </w:tcPr>
+          <w:p>
+            <w:pPr/>
+          </w:p>
+        </w:tc>
+        <w:tc>
+          <w:tcPr>
+            <w:tcW w:w="1264" w:type="dxa"/>
+          </w:tcPr>
+          <w:p>
+            <w:pPr/>
+          </w:p>
+        </w:tc>
+      </w:tr>
+    </w:tbl>
+    <w:p>
+      <w:pPr/>
+      <w:r>
+        <w:t xml:space="preserve">m8 совпадает с прежним </w:t>
+      </w:r>
+      <w:r>
+        <w:rPr>
+          <w:rStyle w:val="CodeChar"/>
+        </w:rPr>
+        <w:t xml:space="preserve">sweep.py</w:t>
+      </w:r>
+      <w:r>
+        <w:t xml:space="preserve"> (</w:t>
+      </w:r>
+      <w:r>
+        <w:rPr>
+          <w:rStyle w:val="CodeChar"/>
+        </w:rPr>
+        <w:t xml:space="preserve">m_ampnorm</w:t>
+      </w:r>
+      <w:r>
+        <w:t xml:space="preserve">), модель согласована.</w:t>
+      </w:r>
+    </w:p>
+    <w:p>
+      <w:pPr>
+        <w:pStyle w:val="Heading3"/>
+      </w:pPr>
+      <w:r>
+        <w:t xml:space="preserve">Таблица 2. Переформулировка A: пространственно-временной паттерн (импульс k приходит только на свою линию → дендрит k)</w:t>
+      </w:r>
+    </w:p>
+    <w:tbl>
+      <w:tblPr>
+        <w:tblStyle w:val="TableGrid"/>
+        <w:tblW w:w="0" w:type="auto"/>
+        <w:tblLayout w:type="fixed"/>
+        <w:tblLook w:val="04A0" w:firstRow="1" w:lastRow="0" w:firstColumn="0" w:lastColumn="0" w:noHBand="0" w:noVBand="1"/>
+      </w:tblPr>
+      <w:tblGrid>
+        <w:gridCol w:w="1170"/>
+        <w:gridCol w:w="829"/>
+        <w:gridCol w:w="978"/>
+        <w:gridCol w:w="1170"/>
+        <w:gridCol w:w="1113"/>
+        <w:gridCol w:w="995"/>
+        <w:gridCol w:w="995"/>
+        <w:gridCol w:w="2110"/>
+      </w:tblGrid>
+      <w:tr>
+        <w:trPr>
+          <w:tblHeader/>
+        </w:trPr>
+        <w:tc>
+          <w:tcPr>
+            <w:tcW w:w="1170" w:type="dxa"/>
+            <w:shd w:val="clear" w:color="auto" w:fill="F2F2F2"/>
+          </w:tcPr>
+          <w:p>
+            <w:pPr/>
+            <w:r>
+              <w:t xml:space="preserve">Модель</w:t>
+            </w:r>
+          </w:p>
+        </w:tc>
+        <w:tc>
+          <w:tcPr>
+            <w:tcW w:w="829" w:type="dxa"/>
+            <w:shd w:val="clear" w:color="auto" w:fill="F2F2F2"/>
+          </w:tcPr>
+          <w:p>
+            <w:pPr/>
+            <w:r>
+              <w:t xml:space="preserve">Span, мс</w:t>
+            </w:r>
+          </w:p>
+        </w:tc>
+        <w:tc>
+          <w:tcPr>
+            <w:tcW w:w="978" w:type="dxa"/>
+            <w:shd w:val="clear" w:color="auto" w:fill="F2F2F2"/>
+          </w:tcPr>
+          <w:p>
+            <w:pPr/>
+            <w:r>
+              <w:t xml:space="preserve">m8</w:t>
+            </w:r>
+          </w:p>
+        </w:tc>
+        <w:tc>
+          <w:tcPr>
+            <w:tcW w:w="1170" w:type="dxa"/>
+            <w:shd w:val="clear" w:color="auto" w:fill="F2F2F2"/>
+          </w:tcPr>
+          <w:p>
+            <w:pPr/>
+            <w:r>
+              <w:t xml:space="preserve">m1(S/24)</w:t>
+            </w:r>
+          </w:p>
+        </w:tc>
+        <w:tc>
+          <w:tcPr>
+            <w:tcW w:w="1113" w:type="dxa"/>
+            <w:shd w:val="clear" w:color="auto" w:fill="F2F2F2"/>
+          </w:tcPr>
+          <w:p>
+            <w:pPr/>
+            <w:r>
+              <w:t xml:space="preserve">m1(S/4)</w:t>
+            </w:r>
+          </w:p>
+        </w:tc>
+        <w:tc>
+          <w:tcPr>
+            <w:tcW w:w="995" w:type="dxa"/>
+            <w:shd w:val="clear" w:color="auto" w:fill="F2F2F2"/>
+          </w:tcPr>
+          <w:p>
+            <w:pPr/>
+            <w:r>
+              <w:t xml:space="preserve">m1(W)</w:t>
+            </w:r>
+          </w:p>
+        </w:tc>
+        <w:tc>
+          <w:tcPr>
+            <w:tcW w:w="995" w:type="dxa"/>
+            <w:shd w:val="clear" w:color="auto" w:fill="F2F2F2"/>
+          </w:tcPr>
+          <w:p>
+            <w:pPr/>
+            <w:r>
+              <w:t xml:space="preserve">m2(W)</w:t>
+            </w:r>
+          </w:p>
+        </w:tc>
+        <w:tc>
+          <w:tcPr>
+            <w:tcW w:w="2110" w:type="dxa"/>
+            <w:shd w:val="clear" w:color="auto" w:fill="F2F2F2"/>
+          </w:tcPr>
+          <w:p>
+            <w:pPr/>
+            <w:r>
+              <w:t xml:space="preserve">Лучший exc+inh: m8 / m1(S/24) / амплитуда EPSP</w:t>
+            </w:r>
+          </w:p>
+        </w:tc>
+      </w:tr>
+      <w:tr>
+        <w:tc>
+          <w:tcPr>
+            <w:tcW w:w="1170" w:type="dxa"/>
+          </w:tcPr>
+          <w:p>
+            <w:pPr/>
+            <w:r>
+              <w:t xml:space="preserve">NSPNeuronGen τ=10</w:t>
+            </w:r>
+          </w:p>
+        </w:tc>
+        <w:tc>
+          <w:tcPr>
+            <w:tcW w:w="829" w:type="dxa"/>
+          </w:tcPr>
+          <w:p>
+            <w:pPr/>
+            <w:r>
+              <w:t xml:space="preserve">25</w:t>
+            </w:r>
+          </w:p>
+        </w:tc>
+        <w:tc>
+          <w:tcPr>
+            <w:tcW w:w="978" w:type="dxa"/>
+          </w:tcPr>
+          <w:p>
+            <w:pPr/>
+            <w:r>
+              <w:t xml:space="preserve">−0.6%</w:t>
+            </w:r>
+          </w:p>
+        </w:tc>
+        <w:tc>
+          <w:tcPr>
+            <w:tcW w:w="1170" w:type="dxa"/>
+          </w:tcPr>
+          <w:p>
+            <w:pPr/>
+            <w:r>
+              <w:t xml:space="preserve">−0.3%</w:t>
+            </w:r>
+          </w:p>
+        </w:tc>
+        <w:tc>
+          <w:tcPr>
+            <w:tcW w:w="1113" w:type="dxa"/>
+          </w:tcPr>
+          <w:p>
+            <w:pPr/>
+            <w:r>
+              <w:t xml:space="preserve">−0.8%</w:t>
+            </w:r>
+          </w:p>
+        </w:tc>
+        <w:tc>
+          <w:tcPr>
+            <w:tcW w:w="995" w:type="dxa"/>
+          </w:tcPr>
+          <w:p>
+            <w:pPr/>
+            <w:r>
+              <w:t xml:space="preserve">+18.0%</w:t>
+            </w:r>
+          </w:p>
+        </w:tc>
+        <w:tc>
+          <w:tcPr>
+            <w:tcW w:w="995" w:type="dxa"/>
+          </w:tcPr>
+          <w:p>
+            <w:pPr/>
+            <w:r>
+              <w:t xml:space="preserve">+39.4%</w:t>
+            </w:r>
+          </w:p>
+        </w:tc>
+        <w:tc>
+          <w:tcPr>
+            <w:tcW w:w="2110" w:type="dxa"/>
+          </w:tcPr>
+          <w:p>
+            <w:pPr/>
+            <w:r>
+              <w:t xml:space="preserve">−0.2% / — / 0.84</w:t>
+            </w:r>
+          </w:p>
+        </w:tc>
+      </w:tr>
+      <w:tr>
+        <w:tc>
+          <w:tcPr>
+            <w:tcW w:w="1170" w:type="dxa"/>
+          </w:tcPr>
+          <w:p>
+            <w:pPr/>
+          </w:p>
+        </w:tc>
+        <w:tc>
+          <w:tcPr>
+            <w:tcW w:w="829" w:type="dxa"/>
+          </w:tcPr>
+          <w:p>
+            <w:pPr/>
+            <w:r>
+              <w:t xml:space="preserve">50</w:t>
+            </w:r>
+          </w:p>
+        </w:tc>
+        <w:tc>
+          <w:tcPr>
+            <w:tcW w:w="978" w:type="dxa"/>
+          </w:tcPr>
+          <w:p>
+            <w:pPr/>
+            <w:r>
+              <w:t xml:space="preserve">+0.3%</w:t>
+            </w:r>
+          </w:p>
+        </w:tc>
+        <w:tc>
+          <w:tcPr>
+            <w:tcW w:w="1170" w:type="dxa"/>
+          </w:tcPr>
+          <w:p>
+            <w:pPr/>
+            <w:r>
+              <w:t xml:space="preserve">−0.4%</w:t>
+            </w:r>
+          </w:p>
+        </w:tc>
+        <w:tc>
+          <w:tcPr>
+            <w:tcW w:w="1113" w:type="dxa"/>
+          </w:tcPr>
+          <w:p>
+            <w:pPr/>
+            <w:r>
+              <w:t xml:space="preserve">+0.7%</w:t>
+            </w:r>
+          </w:p>
+        </w:tc>
+        <w:tc>
+          <w:tcPr>
+            <w:tcW w:w="995" w:type="dxa"/>
+          </w:tcPr>
+          <w:p>
+            <w:pPr/>
+            <w:r>
+              <w:t xml:space="preserve">+21.0%</w:t>
+            </w:r>
+          </w:p>
+        </w:tc>
+        <w:tc>
+          <w:tcPr>
+            <w:tcW w:w="995" w:type="dxa"/>
+          </w:tcPr>
+          <w:p>
+            <w:pPr/>
+            <w:r>
+              <w:t xml:space="preserve">+41.7%</w:t>
+            </w:r>
+          </w:p>
+        </w:tc>
+        <w:tc>
+          <w:tcPr>
+            <w:tcW w:w="2110" w:type="dxa"/>
+          </w:tcPr>
+          <w:p>
+            <w:pPr/>
+            <w:r>
+              <w:t xml:space="preserve">+1.6% / +0.1% / 0.72</w:t>
+            </w:r>
+          </w:p>
+        </w:tc>
+      </w:tr>
+      <w:tr>
+        <w:tc>
+          <w:tcPr>
+            <w:tcW w:w="1170" w:type="dxa"/>
+          </w:tcPr>
+          <w:p>
+            <w:pPr/>
+          </w:p>
+        </w:tc>
+        <w:tc>
+          <w:tcPr>
+            <w:tcW w:w="829" w:type="dxa"/>
+          </w:tcPr>
+          <w:p>
+            <w:pPr/>
+            <w:r>
+              <w:t xml:space="preserve">100</w:t>
+            </w:r>
+          </w:p>
+        </w:tc>
+        <w:tc>
+          <w:tcPr>
+            <w:tcW w:w="978" w:type="dxa"/>
+          </w:tcPr>
+          <w:p>
+            <w:pPr/>
+            <w:r>
+              <w:t xml:space="preserve">+1.8%</w:t>
+            </w:r>
+          </w:p>
+        </w:tc>
+        <w:tc>
+          <w:tcPr>
+            <w:tcW w:w="1170" w:type="dxa"/>
+          </w:tcPr>
+          <w:p>
+            <w:pPr/>
+            <w:r>
+              <w:t xml:space="preserve">−0.2%</w:t>
+            </w:r>
+          </w:p>
+        </w:tc>
+        <w:tc>
+          <w:tcPr>
+            <w:tcW w:w="1113" w:type="dxa"/>
+          </w:tcPr>
+          <w:p>
+            <w:pPr/>
+            <w:r>
+              <w:t xml:space="preserve">+5.3%</w:t>
+            </w:r>
+          </w:p>
+        </w:tc>
+        <w:tc>
+          <w:tcPr>
+            <w:tcW w:w="995" w:type="dxa"/>
+          </w:tcPr>
+          <w:p>
+            <w:pPr/>
+            <w:r>
+              <w:t xml:space="preserve">+21.5%</w:t>
+            </w:r>
+          </w:p>
+        </w:tc>
+        <w:tc>
+          <w:tcPr>
+            <w:tcW w:w="995" w:type="dxa"/>
+          </w:tcPr>
+          <w:p>
+            <w:pPr/>
+            <w:r>
+              <w:t xml:space="preserve">+44.0%</w:t>
+            </w:r>
+          </w:p>
+        </w:tc>
+        <w:tc>
+          <w:tcPr>
+            <w:tcW w:w="2110" w:type="dxa"/>
+          </w:tcPr>
+          <w:p>
+            <w:pPr/>
+            <w:r>
+              <w:t xml:space="preserve">+4.1% / +0.3% / 0.65</w:t>
+            </w:r>
+          </w:p>
+        </w:tc>
+      </w:tr>
+      <w:tr>
+        <w:tc>
+          <w:tcPr>
+            <w:tcW w:w="1170" w:type="dxa"/>
+          </w:tcPr>
+          <w:p>
+            <w:pPr/>
+          </w:p>
+        </w:tc>
+        <w:tc>
+          <w:tcPr>
+            <w:tcW w:w="829" w:type="dxa"/>
+          </w:tcPr>
+          <w:p>
+            <w:pPr/>
+            <w:r>
+              <w:t xml:space="preserve">480</w:t>
+            </w:r>
+          </w:p>
+        </w:tc>
+        <w:tc>
+          <w:tcPr>
+            <w:tcW w:w="978" w:type="dxa"/>
+          </w:tcPr>
+          <w:p>
+            <w:pPr/>
+            <w:r>
+              <w:t xml:space="preserve">+8.7%</w:t>
+            </w:r>
+          </w:p>
+        </w:tc>
+        <w:tc>
+          <w:tcPr>
+            <w:tcW w:w="1170" w:type="dxa"/>
+          </w:tcPr>
+          <w:p>
+            <w:pPr/>
+            <w:r>
+              <w:t xml:space="preserve">+0.7%</w:t>
+            </w:r>
+          </w:p>
+        </w:tc>
+        <w:tc>
+          <w:tcPr>
+            <w:tcW w:w="1113" w:type="dxa"/>
+          </w:tcPr>
+          <w:p>
+            <w:pPr/>
+            <w:r>
+              <w:t xml:space="preserve">+18.3%</w:t>
+            </w:r>
+          </w:p>
+        </w:tc>
+        <w:tc>
+          <w:tcPr>
+            <w:tcW w:w="995" w:type="dxa"/>
+          </w:tcPr>
+          <w:p>
+            <w:pPr/>
+            <w:r>
+              <w:t xml:space="preserve">+22.6%</w:t>
+            </w:r>
+          </w:p>
+        </w:tc>
+        <w:tc>
+          <w:tcPr>
+            <w:tcW w:w="995" w:type="dxa"/>
+          </w:tcPr>
+          <w:p>
+            <w:pPr/>
+            <w:r>
+              <w:t xml:space="preserve">+45.9%</w:t>
+            </w:r>
+          </w:p>
+        </w:tc>
+        <w:tc>
+          <w:tcPr>
+            <w:tcW w:w="2110" w:type="dxa"/>
+          </w:tcPr>
+          <w:p>
+            <w:pPr/>
+            <w:r>
+              <w:rPr>
+                <w:b/>
+              </w:rPr>
+              <w:t xml:space="preserve">+20.6% / +2.5% / 0.25</w:t>
+            </w:r>
+          </w:p>
+        </w:tc>
+      </w:tr>
+      <w:tr>
+        <w:tc>
+          <w:tcPr>
+            <w:tcW w:w="1170" w:type="dxa"/>
+          </w:tcPr>
+          <w:p>
+            <w:pPr/>
+            <w:r>
+              <w:t xml:space="preserve">AsymRm τ=10 (τ_inh=100)</w:t>
+            </w:r>
+          </w:p>
+        </w:tc>
+        <w:tc>
+          <w:tcPr>
+            <w:tcW w:w="829" w:type="dxa"/>
+          </w:tcPr>
+          <w:p>
+            <w:pPr/>
+            <w:r>
+              <w:t xml:space="preserve">50</w:t>
+            </w:r>
+          </w:p>
+        </w:tc>
+        <w:tc>
+          <w:tcPr>
+            <w:tcW w:w="978" w:type="dxa"/>
+          </w:tcPr>
+          <w:p>
+            <w:pPr/>
+            <w:r>
+              <w:t xml:space="preserve">+0.5%</w:t>
+            </w:r>
+          </w:p>
+        </w:tc>
+        <w:tc>
+          <w:tcPr>
+            <w:tcW w:w="1170" w:type="dxa"/>
+          </w:tcPr>
+          <w:p>
+            <w:pPr/>
+            <w:r>
+              <w:t xml:space="preserve">−0.5%</w:t>
+            </w:r>
+          </w:p>
+        </w:tc>
+        <w:tc>
+          <w:tcPr>
+            <w:tcW w:w="1113" w:type="dxa"/>
+          </w:tcPr>
+          <w:p>
+            <w:pPr/>
+            <w:r>
+              <w:t xml:space="preserve">+0.6%</w:t>
+            </w:r>
+          </w:p>
+        </w:tc>
+        <w:tc>
+          <w:tcPr>
+            <w:tcW w:w="995" w:type="dxa"/>
+          </w:tcPr>
+          <w:p>
+            <w:pPr/>
+            <w:r>
+              <w:t xml:space="preserve">+20.7%</w:t>
+            </w:r>
+          </w:p>
+        </w:tc>
+        <w:tc>
+          <w:tcPr>
+            <w:tcW w:w="995" w:type="dxa"/>
+          </w:tcPr>
+          <w:p>
+            <w:pPr/>
+            <w:r>
+              <w:t xml:space="preserve">+41.3%</w:t>
+            </w:r>
+          </w:p>
+        </w:tc>
+        <w:tc>
+          <w:tcPr>
+            <w:tcW w:w="2110" w:type="dxa"/>
+          </w:tcPr>
+          <w:p>
+            <w:pPr/>
+            <w:r>
+              <w:t xml:space="preserve">+1.7% / −0.2% / 0.96</w:t>
+            </w:r>
+          </w:p>
+        </w:tc>
+      </w:tr>
+      <w:tr>
+        <w:tc>
+          <w:tcPr>
+            <w:tcW w:w="1170" w:type="dxa"/>
+          </w:tcPr>
+          <w:p>
+            <w:pPr/>
+          </w:p>
+        </w:tc>
+        <w:tc>
+          <w:tcPr>
+            <w:tcW w:w="829" w:type="dxa"/>
+          </w:tcPr>
+          <w:p>
+            <w:pPr/>
+            <w:r>
+              <w:t xml:space="preserve">100</w:t>
+            </w:r>
+          </w:p>
+        </w:tc>
+        <w:tc>
+          <w:tcPr>
+            <w:tcW w:w="978" w:type="dxa"/>
+          </w:tcPr>
+          <w:p>
+            <w:pPr/>
+            <w:r>
+              <w:t xml:space="preserve">+2.1%</w:t>
+            </w:r>
+          </w:p>
+        </w:tc>
+        <w:tc>
+          <w:tcPr>
+            <w:tcW w:w="1170" w:type="dxa"/>
+          </w:tcPr>
+          <w:p>
+            <w:pPr/>
+            <w:r>
+              <w:t xml:space="preserve">−0.2%</w:t>
+            </w:r>
+          </w:p>
+        </w:tc>
+        <w:tc>
+          <w:tcPr>
+            <w:tcW w:w="1113" w:type="dxa"/>
+          </w:tcPr>
+          <w:p>
+            <w:pPr/>
+            <w:r>
+              <w:t xml:space="preserve">+5.4%</w:t>
+            </w:r>
+          </w:p>
+        </w:tc>
+        <w:tc>
+          <w:tcPr>
+            <w:tcW w:w="995" w:type="dxa"/>
+          </w:tcPr>
+          <w:p>
+            <w:pPr/>
+            <w:r>
+              <w:t xml:space="preserve">+21.4%</w:t>
+            </w:r>
+          </w:p>
+        </w:tc>
+        <w:tc>
+          <w:tcPr>
+            <w:tcW w:w="995" w:type="dxa"/>
+          </w:tcPr>
+          <w:p>
+            <w:pPr/>
+            <w:r>
+              <w:t xml:space="preserve">+43.9%</w:t>
+            </w:r>
+          </w:p>
+        </w:tc>
+        <w:tc>
+          <w:tcPr>
+            <w:tcW w:w="2110" w:type="dxa"/>
+          </w:tcPr>
+          <w:p>
+            <w:pPr/>
+            <w:r>
+              <w:t xml:space="preserve">+2.3% / 0.0% / 1.0</w:t>
+            </w:r>
+          </w:p>
+        </w:tc>
+      </w:tr>
+      <w:tr>
+        <w:tc>
+          <w:tcPr>
+            <w:tcW w:w="1170" w:type="dxa"/>
+          </w:tcPr>
+          <w:p>
+            <w:pPr/>
+          </w:p>
+        </w:tc>
+        <w:tc>
+          <w:tcPr>
+            <w:tcW w:w="829" w:type="dxa"/>
+          </w:tcPr>
+          <w:p>
+            <w:pPr/>
+            <w:r>
+              <w:t xml:space="preserve">480</w:t>
+            </w:r>
+          </w:p>
+        </w:tc>
+        <w:tc>
+          <w:tcPr>
+            <w:tcW w:w="978" w:type="dxa"/>
+          </w:tcPr>
+          <w:p>
+            <w:pPr/>
+            <w:r>
+              <w:t xml:space="preserve">+8.6%</w:t>
+            </w:r>
+          </w:p>
+        </w:tc>
+        <w:tc>
+          <w:tcPr>
+            <w:tcW w:w="1170" w:type="dxa"/>
+          </w:tcPr>
+          <w:p>
+            <w:pPr/>
+            <w:r>
+              <w:t xml:space="preserve">+0.8%</w:t>
+            </w:r>
+          </w:p>
+        </w:tc>
+        <w:tc>
+          <w:tcPr>
+            <w:tcW w:w="1113" w:type="dxa"/>
+          </w:tcPr>
+          <w:p>
+            <w:pPr/>
+            <w:r>
+              <w:t xml:space="preserve">+18.3%</w:t>
+            </w:r>
+          </w:p>
+        </w:tc>
+        <w:tc>
+          <w:tcPr>
+            <w:tcW w:w="995" w:type="dxa"/>
+          </w:tcPr>
+          <w:p>
+            <w:pPr/>
+            <w:r>
+              <w:t xml:space="preserve">+22.6%</w:t>
+            </w:r>
+          </w:p>
+        </w:tc>
+        <w:tc>
+          <w:tcPr>
+            <w:tcW w:w="995" w:type="dxa"/>
+          </w:tcPr>
+          <w:p>
+            <w:pPr/>
+            <w:r>
+              <w:t xml:space="preserve">+45.9%</w:t>
+            </w:r>
+          </w:p>
+        </w:tc>
+        <w:tc>
+          <w:tcPr>
+            <w:tcW w:w="2110" w:type="dxa"/>
+          </w:tcPr>
+          <w:p>
+            <w:pPr/>
+            <w:r>
+              <w:t xml:space="preserve">+8.2% / +1.0% / 1.0</w:t>
+            </w:r>
+          </w:p>
+        </w:tc>
+      </w:tr>
+      <w:tr>
+        <w:tc>
+          <w:tcPr>
+            <w:tcW w:w="1170" w:type="dxa"/>
+          </w:tcPr>
+          <w:p>
+            <w:pPr/>
+            <w:r>
+              <w:t xml:space="preserve">FastSpan τ=2.5</w:t>
+            </w:r>
+          </w:p>
+        </w:tc>
+        <w:tc>
+          <w:tcPr>
+            <w:tcW w:w="829" w:type="dxa"/>
+          </w:tcPr>
+          <w:p>
+            <w:pPr/>
+            <w:r>
+              <w:t xml:space="preserve">25</w:t>
+            </w:r>
+          </w:p>
+        </w:tc>
+        <w:tc>
+          <w:tcPr>
+            <w:tcW w:w="978" w:type="dxa"/>
+          </w:tcPr>
+          <w:p>
+            <w:pPr/>
+            <w:r>
+              <w:t xml:space="preserve">+0.3%</w:t>
+            </w:r>
+          </w:p>
+        </w:tc>
+        <w:tc>
+          <w:tcPr>
+            <w:tcW w:w="1170" w:type="dxa"/>
+          </w:tcPr>
+          <w:p>
+            <w:pPr/>
+            <w:r>
+              <w:t xml:space="preserve">−0.3%</w:t>
+            </w:r>
+          </w:p>
+        </w:tc>
+        <w:tc>
+          <w:tcPr>
+            <w:tcW w:w="1113" w:type="dxa"/>
+          </w:tcPr>
+          <w:p>
+            <w:pPr/>
+            <w:r>
+              <w:t xml:space="preserve">+3.5%</w:t>
+            </w:r>
+          </w:p>
+        </w:tc>
+        <w:tc>
+          <w:tcPr>
+            <w:tcW w:w="995" w:type="dxa"/>
+          </w:tcPr>
+          <w:p>
+            <w:pPr/>
+            <w:r>
+              <w:t xml:space="preserve">+20.8%</w:t>
+            </w:r>
+          </w:p>
+        </w:tc>
+        <w:tc>
+          <w:tcPr>
+            <w:tcW w:w="995" w:type="dxa"/>
+          </w:tcPr>
+          <w:p>
+            <w:pPr/>
+            <w:r>
+              <w:t xml:space="preserve">+42.3%</w:t>
+            </w:r>
+          </w:p>
+        </w:tc>
+        <w:tc>
+          <w:tcPr>
+            <w:tcW w:w="2110" w:type="dxa"/>
+          </w:tcPr>
+          <w:p>
+            <w:pPr/>
+            <w:r>
+              <w:t xml:space="preserve">+3.7% / +0.3% / 0.58</w:t>
+            </w:r>
+          </w:p>
+        </w:tc>
+      </w:tr>
+      <w:tr>
+        <w:tc>
+          <w:tcPr>
+            <w:tcW w:w="1170" w:type="dxa"/>
+          </w:tcPr>
+          <w:p>
+            <w:pPr/>
+          </w:p>
+        </w:tc>
+        <w:tc>
+          <w:tcPr>
+            <w:tcW w:w="829" w:type="dxa"/>
+          </w:tcPr>
+          <w:p>
+            <w:pPr/>
+            <w:r>
+              <w:t xml:space="preserve">50</w:t>
+            </w:r>
+          </w:p>
+        </w:tc>
+        <w:tc>
+          <w:tcPr>
+            <w:tcW w:w="978" w:type="dxa"/>
+          </w:tcPr>
+          <w:p>
+            <w:pPr/>
+            <w:r>
+              <w:t xml:space="preserve">+3.5%</w:t>
+            </w:r>
+          </w:p>
+        </w:tc>
+        <w:tc>
+          <w:tcPr>
+            <w:tcW w:w="1170" w:type="dxa"/>
+          </w:tcPr>
+          <w:p>
+            <w:pPr/>
+            <w:r>
+              <w:t xml:space="preserve">0.0%</w:t>
+            </w:r>
+          </w:p>
+        </w:tc>
+        <w:tc>
+          <w:tcPr>
+            <w:tcW w:w="1113" w:type="dxa"/>
+          </w:tcPr>
+          <w:p>
+            <w:pPr/>
+            <w:r>
+              <w:t xml:space="preserve">+10.5%</w:t>
+            </w:r>
+          </w:p>
+        </w:tc>
+        <w:tc>
+          <w:tcPr>
+            <w:tcW w:w="995" w:type="dxa"/>
+          </w:tcPr>
+          <w:p>
+            <w:pPr/>
+            <w:r>
+              <w:t xml:space="preserve">+22.2%</w:t>
+            </w:r>
+          </w:p>
+        </w:tc>
+        <w:tc>
+          <w:tcPr>
+            <w:tcW w:w="995" w:type="dxa"/>
+          </w:tcPr>
+          <w:p>
+            <w:pPr/>
+            <w:r>
+              <w:t xml:space="preserve">+44.8%</w:t>
+            </w:r>
+          </w:p>
+        </w:tc>
+        <w:tc>
+          <w:tcPr>
+            <w:tcW w:w="2110" w:type="dxa"/>
+          </w:tcPr>
+          <w:p>
+            <w:pPr/>
+            <w:r>
+              <w:rPr>
+                <w:b/>
+              </w:rPr>
+              <w:t xml:space="preserve">+10.6% / +0.9% / 0.30</w:t>
+            </w:r>
+          </w:p>
+        </w:tc>
+      </w:tr>
+      <w:tr>
+        <w:tc>
+          <w:tcPr>
+            <w:tcW w:w="1170" w:type="dxa"/>
+          </w:tcPr>
+          <w:p>
+            <w:pPr/>
+          </w:p>
+        </w:tc>
+        <w:tc>
+          <w:tcPr>
+            <w:tcW w:w="829" w:type="dxa"/>
+          </w:tcPr>
+          <w:p>
+            <w:pPr/>
+            <w:r>
+              <w:t xml:space="preserve">100</w:t>
+            </w:r>
+          </w:p>
+        </w:tc>
+        <w:tc>
+          <w:tcPr>
+            <w:tcW w:w="978" w:type="dxa"/>
+          </w:tcPr>
+          <w:p>
+            <w:pPr/>
+            <w:r>
+              <w:t xml:space="preserve">+6.9%</w:t>
+            </w:r>
+          </w:p>
+        </w:tc>
+        <w:tc>
+          <w:tcPr>
+            <w:tcW w:w="1170" w:type="dxa"/>
+          </w:tcPr>
+          <w:p>
+            <w:pPr/>
+            <w:r>
+              <w:t xml:space="preserve">+0.6%</w:t>
+            </w:r>
+          </w:p>
+        </w:tc>
+        <w:tc>
+          <w:tcPr>
+            <w:tcW w:w="1113" w:type="dxa"/>
+          </w:tcPr>
+          <w:p>
+            <w:pPr/>
+            <w:r>
+              <w:t xml:space="preserve">+15.8%</w:t>
+            </w:r>
+          </w:p>
+        </w:tc>
+        <w:tc>
+          <w:tcPr>
+            <w:tcW w:w="995" w:type="dxa"/>
+          </w:tcPr>
+          <w:p>
+            <w:pPr/>
+            <w:r>
+              <w:t xml:space="preserve">+22.2%</w:t>
+            </w:r>
+          </w:p>
+        </w:tc>
+        <w:tc>
+          <w:tcPr>
+            <w:tcW w:w="995" w:type="dxa"/>
+          </w:tcPr>
+          <w:p>
+            <w:pPr/>
+            <w:r>
+              <w:t xml:space="preserve">+45.4%</w:t>
+            </w:r>
+          </w:p>
+        </w:tc>
+        <w:tc>
+          <w:tcPr>
+            <w:tcW w:w="2110" w:type="dxa"/>
+          </w:tcPr>
+          <w:p>
+            <w:pPr/>
+            <w:r>
+              <w:rPr>
+                <w:b/>
+              </w:rPr>
+              <w:t xml:space="preserve">+19.0% / +2.0% / 0.29</w:t>
+            </w:r>
+          </w:p>
+        </w:tc>
+      </w:tr>
+    </w:tbl>
+    <w:p>
+      <w:pPr/>
+      <w:r>
+        <w:rPr>
+          <w:b/>
+        </w:rPr>
+        <w:t xml:space="preserve">Вывод A.</w:t>
+      </w:r>
+      <w:r>
+        <w:t xml:space="preserve"> Если паттерн подаётся по 4 отдельным входным линиям (по одной на дендрит), запас становится положительным без новых элементов. Порядок величин:</w:t>
+      </w:r>
+    </w:p>
+    <w:p>
+      <w:pPr>
+        <w:pStyle w:val="ListParagraph"/>
+        <w:numPr>
+          <w:ilvl w:val="0"/>
+          <w:numId w:val="24"/>
+        </w:numPr>
+      </w:pPr>
+      <w:r>
+        <w:t xml:space="preserve">для сдвигов ≥ S/4: +5…+18%;</w:t>
+      </w:r>
+    </w:p>
+    <w:p>
+      <w:pPr>
+        <w:pStyle w:val="ListParagraph"/>
+        <w:numPr>
+          <w:ilvl w:val="0"/>
+          <w:numId w:val="24"/>
+        </w:numPr>
+      </w:pPr>
+      <w:r>
+        <w:t xml:space="preserve">для сдвигов ≥ W: +18…+23%;</w:t>
+      </w:r>
+    </w:p>
+    <w:p>
+      <w:pPr>
+        <w:pStyle w:val="ListParagraph"/>
+        <w:numPr>
+          <w:ilvl w:val="0"/>
+          <w:numId w:val="24"/>
+        </w:numPr>
+      </w:pPr>
+      <w:r>
+        <w:t xml:space="preserve">для двух сдвинутых импульсов: +40…+46%.</w:t>
+      </w:r>
+    </w:p>
+    <w:p>
+      <w:pPr/>
+      <w:r>
+        <w:t xml:space="preserve">Самый жёсткий критерий — один импульс сдвинут на S/24 — остаётся около 0…+2.5%. Его нужно заменить требованием «m ≥ 10% при Δ ≥ S/4» (или ≥ W). Этого требует физика пассивного кабеля, а не тренер. Изменения в реализации: у </w:t>
+      </w:r>
+      <w:r>
+        <w:rPr>
+          <w:rStyle w:val="CodeChar"/>
+        </w:rPr>
+        <w:t xml:space="preserve">DatasetMatrix</w:t>
+      </w:r>
+      <w:r>
+        <w:t xml:space="preserve"> 4 выхода вместо одного, отвод k → только кончик дендрита k. Branch так не разделить: у него один дендрит, поэтому A применима к Classic.</w:t>
+      </w:r>
+    </w:p>
+    <w:p>
+      <w:pPr>
+        <w:pStyle w:val="Heading3"/>
+      </w:pPr>
+      <w:r>
+        <w:t xml:space="preserve">Вариант 2: exc+inh на сегментах того же дендрита (без новых задержек)</w:t>
+      </w:r>
+    </w:p>
+    <w:p>
+      <w:pPr/>
+      <w:r>
+        <w:rPr>
+          <w:b/>
+        </w:rPr>
+        <w:t xml:space="preserve">Схема.</w:t>
+      </w:r>
+      <w:r>
+        <w:t xml:space="preserve"> На каждом сегменте уже есть </w:t>
+      </w:r>
+      <w:r>
+        <w:rPr>
+          <w:rStyle w:val="CodeChar"/>
+        </w:rPr>
+        <w:t xml:space="preserve">ExcSynapse1</w:t>
+      </w:r>
+      <w:r>
+        <w:t xml:space="preserve"> и </w:t>
+      </w:r>
+      <w:r>
+        <w:rPr>
+          <w:rStyle w:val="CodeChar"/>
+        </w:rPr>
+        <w:t xml:space="preserve">InhSynapse1</w:t>
+      </w:r>
+      <w:r>
+        <w:t xml:space="preserve">. Входной импульс подаётся на </w:t>
+      </w:r>
+      <w:r>
+        <w:rPr>
+          <w:rStyle w:val="CodeChar"/>
+        </w:rPr>
+        <w:t xml:space="preserve">ExcSynapse</w:t>
+      </w:r>
+      <w:r>
+        <w:t xml:space="preserve"> сегмента L и одновременно на </w:t>
+      </w:r>
+      <w:r>
+        <w:rPr>
+          <w:rStyle w:val="CodeChar"/>
+        </w:rPr>
+        <w:t xml:space="preserve">InhSynapse</w:t>
+      </w:r>
+      <w:r>
+        <w:t xml:space="preserve"> сегмента L+d того же дендрита (дальше от сомы). Торможение доходит до сомы позже на ≈ d·τ по тому же кабелю — задержкой служит сам дендрит, новых элементов нет. Перебирались d ∈ {−8…24} (минус — проксимальнее, 0 — тот же сегмент) и вес α ∈ [0.2, 3]; длины L пересинхронизировались под суммарное ядро. Варианты с амплитудой EPSP &lt; 20% отбрасывались. Почти всегда лучшим было </w:t>
+      </w:r>
+      <w:r>
+        <w:rPr>
+          <w:b/>
+        </w:rPr>
+        <w:t xml:space="preserve">дистальное</w:t>
+      </w:r>
+      <w:r>
+        <w:t xml:space="preserve"> торможение (d = 4…12, α ≈ 0.6…1); у AsymRm в отдельных линиях — проксимальное, с малым выигрышем.</w:t>
+      </w:r>
+    </w:p>
+    <w:p>
+      <w:pPr/>
+      <w:r>
+        <w:rPr>
+          <w:b/>
+        </w:rPr>
+        <w:t xml:space="preserve">Результат.</w:t>
+      </w:r>
+    </w:p>
+    <w:p>
+      <w:pPr>
+        <w:pStyle w:val="ListParagraph"/>
+        <w:numPr>
+          <w:ilvl w:val="0"/>
+          <w:numId w:val="25"/>
+        </w:numPr>
+      </w:pPr>
+      <w:r>
+        <w:rPr>
+          <w:b/>
+        </w:rPr>
+        <w:t xml:space="preserve">Текущая постановка (одна линия) — отказ.</w:t>
+      </w:r>
+      <w:r>
+        <w:t xml:space="preserve"> Exc+inh сужает EPSP на 10–30% (например, 79 → 64 мс при 100 мс) и поднимает m8 на 0.5–7 п.п., но </w:t>
+      </w:r>
+      <w:r>
+        <w:rPr>
+          <w:b/>
+        </w:rPr>
+        <w:t xml:space="preserve">ни в одной ячейке запас не становится положительным</w:t>
+      </w:r>
+      <w:r>
+        <w:t xml:space="preserve"> (лучшее −0.4% на FastSpan@25, −0.8% на τ10@100). Причина — перекрёстные члены одной линии: торможение режет хвосты и у цели, и у foil'ов одинаково.</w:t>
+      </w:r>
+    </w:p>
+    <w:p>
+      <w:pPr>
+        <w:pStyle w:val="ListParagraph"/>
+        <w:numPr>
+          <w:ilvl w:val="0"/>
+          <w:numId w:val="25"/>
+        </w:numPr>
+      </w:pPr>
+      <w:r>
+        <w:rPr>
+          <w:b/>
+        </w:rPr>
+        <w:t xml:space="preserve">Вместе с переформулировкой A — работает.</w:t>
+      </w:r>
+      <w:r>
+        <w:t xml:space="preserve"> FastSpan: m8 +10.6% на 50 мс и +19.0% на 100 мс. τ=10 мс: +20.6% на 480 мс. Цена — амплитуда EPSP падает до 25–60% (компенсировать снижением TipR, проверив пол Rs).</w:t>
+      </w:r>
+    </w:p>
+    <w:p>
+      <w:pPr>
+        <w:pStyle w:val="ListParagraph"/>
+        <w:numPr>
+          <w:ilvl w:val="0"/>
+          <w:numId w:val="25"/>
+        </w:numPr>
+      </w:pPr>
+      <w:r>
+        <w:rPr>
+          <w:b/>
+        </w:rPr>
+        <w:t xml:space="preserve">Нужно симметричное торможение.</w:t>
+      </w:r>
+      <w:r>
+        <w:t xml:space="preserve"> У AsymRm (Rm тормозного канала в 10 раз больше, τ_inh = 100 мс) торможение слишком медленное и почти не помогает (+8.2% против +20.6% при τ_inh = τ). Для варианта 2 нужен класс нейрона с Rm_inh = Rm_exc. Это параметр, а не новая задержка.</w:t>
+      </w:r>
+    </w:p>
+    <w:p>
+      <w:pPr/>
+      <w:r>
+        <w:rPr>
+          <w:b/>
+        </w:rPr>
+        <w:t xml:space="preserve">Ограничения расчёта.</w:t>
+      </w:r>
+      <w:r>
+        <w:t xml:space="preserve"> Суперпозиция линейная: шунтирующее действие тормозного канала не учтено, а LTZ усредняет каналы как сумму. Пол Rs и квантование TipR игнорируются. Исторический PASS </w:t>
+      </w:r>
+      <w:r>
+        <w:rPr>
+          <w:rStyle w:val="CodeChar"/>
+        </w:rPr>
+        <w:t xml:space="preserve">br25_nextseg</w:t>
+      </w:r>
+      <w:r>
+        <w:t xml:space="preserve"> этим линейным механизмом не объясняется (в одной линии exc+inh не даёт плюса). Значит, он опирается на нелинейность </w:t>
+      </w:r>
+      <w:r>
+        <w:rPr>
+          <w:rStyle w:val="CodeChar"/>
+        </w:rPr>
+        <w:t xml:space="preserve">NextSegmentInhibition</w:t>
+      </w:r>
+      <w:r>
+        <w:t xml:space="preserve"> или на хрупкий порог (E1.5 FRAGILE).</w:t>
+      </w:r>
+    </w:p>
+    <w:p>
+      <w:pPr>
+        <w:pStyle w:val="Heading3"/>
+      </w:pPr>
+      <w:r>
+        <w:t xml:space="preserve">Итог: какие переформулировки дают положительный запас</w:t>
+      </w:r>
+    </w:p>
+    <w:tbl>
+      <w:tblPr>
+        <w:tblStyle w:val="TableGrid"/>
+        <w:tblW w:w="0" w:type="auto"/>
+        <w:tblLayout w:type="fixed"/>
+        <w:tblLook w:val="04A0" w:firstRow="1" w:lastRow="0" w:firstColumn="0" w:lastColumn="0" w:noHBand="0" w:noVBand="1"/>
+      </w:tblPr>
+      <w:tblGrid>
+        <w:gridCol w:w="3771"/>
+        <w:gridCol w:w="2202"/>
+        <w:gridCol w:w="1362"/>
+        <w:gridCol w:w="2025"/>
+      </w:tblGrid>
+      <w:tr>
+        <w:trPr>
+          <w:tblHeader/>
+        </w:trPr>
+        <w:tc>
+          <w:tcPr>
+            <w:tcW w:w="3771" w:type="dxa"/>
+            <w:shd w:val="clear" w:color="auto" w:fill="F2F2F2"/>
+          </w:tcPr>
+          <w:p>
+            <w:pPr/>
+            <w:r>
+              <w:t xml:space="preserve">Переформулировка</w:t>
+            </w:r>
+          </w:p>
+        </w:tc>
+        <w:tc>
+          <w:tcPr>
+            <w:tcW w:w="2202" w:type="dxa"/>
+            <w:shd w:val="clear" w:color="auto" w:fill="F2F2F2"/>
+          </w:tcPr>
+          <w:p>
+            <w:pPr/>
+            <w:r>
+              <w:t xml:space="preserve">Новые задержки</w:t>
+            </w:r>
+          </w:p>
+        </w:tc>
+        <w:tc>
+          <w:tcPr>
+            <w:tcW w:w="1362" w:type="dxa"/>
+            <w:shd w:val="clear" w:color="auto" w:fill="F2F2F2"/>
+          </w:tcPr>
+          <w:p>
+            <w:pPr/>
+            <w:r>
+              <w:t xml:space="preserve">Запас (модель)</w:t>
+            </w:r>
+          </w:p>
+        </w:tc>
+        <w:tc>
+          <w:tcPr>
+            <w:tcW w:w="2025" w:type="dxa"/>
+            <w:shd w:val="clear" w:color="auto" w:fill="F2F2F2"/>
+          </w:tcPr>
+          <w:p>
+            <w:pPr/>
+            <w:r>
+              <w:t xml:space="preserve">Статус</w:t>
+            </w:r>
+          </w:p>
+        </w:tc>
+      </w:tr>
+      <w:tr>
+        <w:tc>
+          <w:tcPr>
+            <w:tcW w:w="3771" w:type="dxa"/>
+          </w:tcPr>
+          <w:p>
+            <w:pPr/>
+            <w:r>
+              <w:t xml:space="preserve">Только увеличить Δ в текущей топологии</w:t>
+            </w:r>
+          </w:p>
+        </w:tc>
+        <w:tc>
+          <w:tcPr>
+            <w:tcW w:w="2202" w:type="dxa"/>
+          </w:tcPr>
+          <w:p>
+            <w:pPr/>
+            <w:r>
+              <w:t xml:space="preserve">нет</w:t>
+            </w:r>
+          </w:p>
+        </w:tc>
+        <w:tc>
+          <w:tcPr>
+            <w:tcW w:w="1362" w:type="dxa"/>
+          </w:tcPr>
+          <w:p>
+            <w:pPr/>
+            <w:r>
+              <w:t xml:space="preserve">&lt; 0 до Δ ≈ 2W</w:t>
+            </w:r>
+          </w:p>
+        </w:tc>
+        <w:tc>
+          <w:tcPr>
+            <w:tcW w:w="2025" w:type="dxa"/>
+          </w:tcPr>
+          <w:p>
+            <w:pPr/>
+            <w:r>
+              <w:t xml:space="preserve">отказ</w:t>
+            </w:r>
+          </w:p>
+        </w:tc>
+      </w:tr>
+      <w:tr>
+        <w:tc>
+          <w:tcPr>
+            <w:tcW w:w="3771" w:type="dxa"/>
+          </w:tcPr>
+          <w:p>
+            <w:pPr/>
+            <w:r>
+              <w:t xml:space="preserve">exc+inh на сегментах в текущей топологии</w:t>
+            </w:r>
+          </w:p>
+        </w:tc>
+        <w:tc>
+          <w:tcPr>
+            <w:tcW w:w="2202" w:type="dxa"/>
+          </w:tcPr>
+          <w:p>
+            <w:pPr/>
+            <w:r>
+              <w:t xml:space="preserve">нет</w:t>
+            </w:r>
+          </w:p>
+        </w:tc>
+        <w:tc>
+          <w:tcPr>
+            <w:tcW w:w="1362" w:type="dxa"/>
+          </w:tcPr>
+          <w:p>
+            <w:pPr/>
+            <w:r>
+              <w:t xml:space="preserve">&lt; 0</w:t>
+            </w:r>
+          </w:p>
+        </w:tc>
+        <w:tc>
+          <w:tcPr>
+            <w:tcW w:w="2025" w:type="dxa"/>
+          </w:tcPr>
+          <w:p>
+            <w:pPr/>
+            <w:r>
+              <w:rPr>
+                <w:b/>
+              </w:rPr>
+              <w:t xml:space="preserve">отказ</w:t>
+            </w:r>
+          </w:p>
+        </w:tc>
+      </w:tr>
+      <w:tr>
+        <w:tc>
+          <w:tcPr>
+            <w:tcW w:w="3771" w:type="dxa"/>
+          </w:tcPr>
+          <w:p>
+            <w:pPr/>
+            <w:r>
+              <w:t xml:space="preserve">A: отдельная входная линия на дендрит (Classic)</w:t>
+            </w:r>
+          </w:p>
+        </w:tc>
+        <w:tc>
+          <w:tcPr>
+            <w:tcW w:w="2202" w:type="dxa"/>
+          </w:tcPr>
+          <w:p>
+            <w:pPr/>
+            <w:r>
+              <w:t xml:space="preserve">нет</w:t>
+            </w:r>
+          </w:p>
+        </w:tc>
+        <w:tc>
+          <w:tcPr>
+            <w:tcW w:w="1362" w:type="dxa"/>
+          </w:tcPr>
+          <w:p>
+            <w:pPr/>
+            <w:r>
+              <w:t xml:space="preserve">+5…+23% при Δ ≥ S/4…W</w:t>
+            </w:r>
+          </w:p>
+        </w:tc>
+        <w:tc>
+          <w:tcPr>
+            <w:tcW w:w="2025" w:type="dxa"/>
+          </w:tcPr>
+          <w:p>
+            <w:pPr/>
+            <w:r>
+              <w:t xml:space="preserve">рекомендуется</w:t>
+            </w:r>
+          </w:p>
+        </w:tc>
+      </w:tr>
+      <w:tr>
+        <w:tc>
+          <w:tcPr>
+            <w:tcW w:w="3771" w:type="dxa"/>
+          </w:tcPr>
+          <w:p>
+            <w:pPr/>
+            <w:r>
+              <w:t xml:space="preserve">A + exc+inh на сегментах, симметричное торможение</w:t>
+            </w:r>
+          </w:p>
+        </w:tc>
+        <w:tc>
+          <w:tcPr>
+            <w:tcW w:w="2202" w:type="dxa"/>
+          </w:tcPr>
+          <w:p>
+            <w:pPr/>
+            <w:r>
+              <w:t xml:space="preserve">нет</w:t>
+            </w:r>
+          </w:p>
+        </w:tc>
+        <w:tc>
+          <w:tcPr>
+            <w:tcW w:w="1362" w:type="dxa"/>
+          </w:tcPr>
+          <w:p>
+            <w:pPr/>
+            <w:r>
+              <w:t xml:space="preserve">m8 до +19…21%</w:t>
+            </w:r>
+          </w:p>
+        </w:tc>
+        <w:tc>
+          <w:tcPr>
+            <w:tcW w:w="2025" w:type="dxa"/>
+          </w:tcPr>
+          <w:p>
+            <w:pPr/>
+            <w:r>
+              <w:t xml:space="preserve">рекомендуется как следующий шаг</w:t>
+            </w:r>
+          </w:p>
+        </w:tc>
+      </w:tr>
+      <w:tr>
+        <w:tc>
+          <w:tcPr>
+            <w:tcW w:w="3771" w:type="dxa"/>
+          </w:tcPr>
+          <w:p>
+            <w:pPr/>
+            <w:r>
+              <w:t xml:space="preserve">Аксонная задержка + быстрый EPSP (F1b)</w:t>
+            </w:r>
+          </w:p>
+        </w:tc>
+        <w:tc>
+          <w:tcPr>
+            <w:tcW w:w="2202" w:type="dxa"/>
+          </w:tcPr>
+          <w:p>
+            <w:pPr/>
+            <w:r>
+              <w:t xml:space="preserve">да</w:t>
+            </w:r>
+          </w:p>
+        </w:tc>
+        <w:tc>
+          <w:tcPr>
+            <w:tcW w:w="1362" w:type="dxa"/>
+          </w:tcPr>
+          <w:p>
+            <w:pPr/>
+            <w:r>
+              <w:t xml:space="preserve">+12…+25%</w:t>
+            </w:r>
+          </w:p>
+        </w:tc>
+        <w:tc>
+          <w:tcPr>
+            <w:tcW w:w="2025" w:type="dxa"/>
+          </w:tcPr>
+          <w:p>
+            <w:pPr/>
+            <w:r>
+              <w:t xml:space="preserve">запасной путь</w:t>
+            </w:r>
+          </w:p>
+        </w:tc>
+      </w:tr>
+    </w:tbl>
+    <w:p>
+      <w:pPr>
+        <w:pStyle w:val="Heading3"/>
+      </w:pPr>
+      <w:r>
+        <w:t xml:space="preserve">Следующие шаги (дешёвые)</w:t>
+      </w:r>
+    </w:p>
+    <w:p>
+      <w:pPr>
+        <w:pStyle w:val="ListParagraph"/>
+        <w:numPr>
+          <w:ilvl w:val="0"/>
+          <w:numId w:val="26"/>
+        </w:numPr>
+      </w:pPr>
+      <w:r>
+        <w:t xml:space="preserve">Console-проверка A на одном Classic-шаблоне: 4 выхода генератора, отвод k → дендрит k. Пробник </w:t>
+      </w:r>
+      <w:r>
+        <w:rPr>
+          <w:rStyle w:val="CodeChar"/>
+        </w:rPr>
+        <w:t xml:space="preserve">tl_probe_kernels.py</w:t>
+      </w:r>
+      <w:r>
+        <w:t xml:space="preserve"> с ISI ≫ W уже даёт ядра. Сравнить m8 и m1(S/4) с таблицей 2 (допуск 2 п.п.).</w:t>
+      </w:r>
+    </w:p>
+    <w:p>
+      <w:pPr>
+        <w:pStyle w:val="ListParagraph"/>
+        <w:numPr>
+          <w:ilvl w:val="0"/>
+          <w:numId w:val="26"/>
+        </w:numPr>
+      </w:pPr>
+      <w:r>
+        <w:t xml:space="preserve">Console-проверка варианта 2 на одном дендрите: отвод генератора на </w:t>
+      </w:r>
+      <w:r>
+        <w:rPr>
+          <w:rStyle w:val="CodeChar"/>
+        </w:rPr>
+        <w:t xml:space="preserve">InhSynapse</w:t>
+      </w:r>
+      <w:r>
+        <w:t xml:space="preserve"> сегмента L+d. Измерить форму суммарного ядра против модели (FWHM, пик) для d = 4 и 8. Отдельно проверить шунтирующий эффект.</w:t>
+      </w:r>
+    </w:p>
+    <w:p>
+      <w:pPr>
+        <w:pStyle w:val="ListParagraph"/>
+        <w:numPr>
+          <w:ilvl w:val="0"/>
+          <w:numId w:val="26"/>
+        </w:numPr>
+      </w:pPr>
+      <w:r>
+        <w:t xml:space="preserve">Только после 1–2 — изменения тренера: длина пары (L, L+d) растёт вместе; α — через </w:t>
+      </w:r>
+      <w:r>
+        <w:rPr>
+          <w:rStyle w:val="CodeChar"/>
+        </w:rPr>
+        <w:t xml:space="preserve">InhSynapseResistance</w:t>
+      </w:r>
+      <w:r>
+        <w:t xml:space="preserve">; критерий Done — запас на калибровочных foil'ах.</w:t>
+      </w:r>
+    </w:p>
+    <w:p>
+      <w:pPr>
+        <w:pStyle w:val="ListParagraph"/>
+        <w:numPr>
+          <w:ilvl w:val="0"/>
+          <w:numId w:val="26"/>
+        </w:numPr>
+      </w:pPr>
+      <w:r>
+        <w:t xml:space="preserve">Заменить тестовый критерий: кривая m(Δ) и требование m ≥ 10% при Δ ≥ S/4 вместо PASS/FAIL на 8 паттернах.</w:t>
       </w:r>
     </w:p>
     <w:sectPr>
@@ -6488,6 +10049,33 @@
   </w:num>
   <w:num w:numId="20">
     <w:abstractNumId w:val="0"/>
+  </w:num>
+  <w:num w:numId="21">
+    <w:abstractNumId w:val="1"/>
+    <w:lvlOverride w:ilvl="0">
+      <w:startOverride w:val="1"/>
+    </w:lvlOverride>
+  </w:num>
+  <w:num w:numId="22">
+    <w:abstractNumId w:val="1"/>
+    <w:lvlOverride w:ilvl="0">
+      <w:startOverride w:val="1"/>
+    </w:lvlOverride>
+  </w:num>
+  <w:num w:numId="23">
+    <w:abstractNumId w:val="0"/>
+  </w:num>
+  <w:num w:numId="24">
+    <w:abstractNumId w:val="0"/>
+  </w:num>
+  <w:num w:numId="25">
+    <w:abstractNumId w:val="0"/>
+  </w:num>
+  <w:num w:numId="26">
+    <w:abstractNumId w:val="1"/>
+    <w:lvlOverride w:ilvl="0">
+      <w:startOverride w:val="1"/>
+    </w:lvlOverride>
   </w:num>
 </w:numbering>
 </file>

</xml_diff>